<commit_message>
Convert Markdown to DOCX
</commit_message>
<xml_diff>
--- a/TEST-DOCX-Data Management Plan Template.docx
+++ b/TEST-DOCX-Data Management Plan Template.docx
@@ -8,6 +8,7 @@
       </w:pPr>
       <w:r>
         <w:rPr>
+          <w:bCs/>
           <w:b/>
         </w:rPr>
         <w:t xml:space="preserve">Reference to Master DM Plan (if applicable)</w:t>
@@ -19,42 +20,49 @@
       </w:pPr>
       <w:r>
         <w:rPr>
+          <w:iCs/>
           <w:i/>
         </w:rPr>
         <w:t xml:space="preserve">Data Management Plans (DMP) may be hierarchical. If this DMP inherits</w:t>
       </w:r>
       <w:r>
         <w:rPr>
-          <w:i/>
-        </w:rPr>
-        <w:t xml:space="preserve"> </w:t>
-      </w:r>
-      <w:r>
-        <w:rPr>
+          <w:iCs/>
+          <w:i/>
+        </w:rPr>
+        <w:t xml:space="preserve"> </w:t>
+      </w:r>
+      <w:r>
+        <w:rPr>
+          <w:iCs/>
           <w:i/>
         </w:rPr>
         <w:t xml:space="preserve">provisions from a higher-level DMP already submitted to the Repository,</w:t>
       </w:r>
       <w:r>
         <w:rPr>
-          <w:i/>
-        </w:rPr>
-        <w:t xml:space="preserve"> </w:t>
-      </w:r>
-      <w:r>
-        <w:rPr>
+          <w:iCs/>
+          <w:i/>
+        </w:rPr>
+        <w:t xml:space="preserve"> </w:t>
+      </w:r>
+      <w:r>
+        <w:rPr>
+          <w:iCs/>
           <w:i/>
         </w:rPr>
         <w:t xml:space="preserve">then this more-specific Plan only needs to provide information that</w:t>
       </w:r>
       <w:r>
         <w:rPr>
-          <w:i/>
-        </w:rPr>
-        <w:t xml:space="preserve"> </w:t>
-      </w:r>
-      <w:r>
-        <w:rPr>
+          <w:iCs/>
+          <w:i/>
+        </w:rPr>
+        <w:t xml:space="preserve"> </w:t>
+      </w:r>
+      <w:r>
+        <w:rPr>
+          <w:iCs/>
           <w:i/>
         </w:rPr>
         <w:t xml:space="preserve">differs from what was provided in the Master DMP.</w:t>
@@ -66,6 +74,7 @@
       </w:pPr>
       <w:r>
         <w:rPr>
+          <w:bCs/>
           <w:b/>
         </w:rPr>
         <w:t xml:space="preserve">URL of higher-level DMP (if any) as submitted to DM Plan Repository:</w:t>
@@ -91,6 +100,7 @@
       </w:pPr>
       <w:r>
         <w:rPr>
+          <w:bCs/>
           <w:b/>
         </w:rPr>
         <w:t xml:space="preserve">InPort Catalog ID:</w:t>
@@ -110,6 +120,7 @@
       </w:pPr>
       <w:r>
         <w:rPr>
+          <w:bCs/>
           <w:b/>
         </w:rPr>
         <w:t xml:space="preserve">Introduction and Overview:</w:t>
@@ -155,6 +166,7 @@
       </w:pPr>
       <w:r>
         <w:rPr>
+          <w:bCs/>
           <w:b/>
         </w:rPr>
         <w:t xml:space="preserve">Data Management Plan</w:t>
@@ -169,6 +181,7 @@
       </w:pPr>
       <w:r>
         <w:rPr>
+          <w:bCs/>
           <w:b/>
         </w:rPr>
         <w:t xml:space="preserve">General Description of Data to be Managed</w:t>
@@ -184,18 +197,21 @@
       </w:pPr>
       <w:r>
         <w:rPr>
+          <w:bCs/>
           <w:b/>
         </w:rPr>
         <w:t xml:space="preserve">Name of the Data, data collection Project, or</w:t>
       </w:r>
       <w:r>
         <w:rPr>
-          <w:b/>
-        </w:rPr>
-        <w:t xml:space="preserve"> </w:t>
-      </w:r>
-      <w:r>
-        <w:rPr>
+          <w:bCs/>
+          <w:b/>
+        </w:rPr>
+        <w:t xml:space="preserve"> </w:t>
+      </w:r>
+      <w:r>
+        <w:rPr>
+          <w:bCs/>
           <w:b/>
         </w:rPr>
         <w:t xml:space="preserve">data-producing &gt; Program:</w:t>
@@ -225,6 +241,7 @@
       </w:pPr>
       <w:r>
         <w:rPr>
+          <w:bCs/>
           <w:b/>
         </w:rPr>
         <w:t xml:space="preserve">Summary description of the data:</w:t>
@@ -248,18 +265,21 @@
       </w:pPr>
       <w:r>
         <w:rPr>
+          <w:bCs/>
           <w:b/>
         </w:rPr>
         <w:t xml:space="preserve">Is this a one-time data collection, or an ongoing series of &gt;</w:t>
       </w:r>
       <w:r>
         <w:rPr>
-          <w:b/>
-        </w:rPr>
-        <w:t xml:space="preserve"> </w:t>
-      </w:r>
-      <w:r>
-        <w:rPr>
+          <w:bCs/>
+          <w:b/>
+        </w:rPr>
+        <w:t xml:space="preserve"> </w:t>
+      </w:r>
+      <w:r>
+        <w:rPr>
+          <w:bCs/>
           <w:b/>
         </w:rPr>
         <w:t xml:space="preserve">measurements?</w:t>
@@ -289,6 +309,7 @@
       </w:pPr>
       <w:r>
         <w:rPr>
+          <w:bCs/>
           <w:b/>
         </w:rPr>
         <w:t xml:space="preserve">Actual or planned temporal coverage of the data:</w:t>
@@ -312,6 +333,7 @@
       </w:pPr>
       <w:r>
         <w:rPr>
+          <w:bCs/>
           <w:b/>
         </w:rPr>
         <w:t xml:space="preserve">Actual or planned geographic coverage of the data:</w:t>
@@ -335,6 +357,7 @@
       </w:pPr>
       <w:r>
         <w:rPr>
+          <w:bCs/>
           <w:b/>
         </w:rPr>
         <w:t xml:space="preserve">Type(s) of data:</w:t>
@@ -346,18 +369,21 @@
       </w:pPr>
       <w:r>
         <w:rPr>
+          <w:iCs/>
           <w:i/>
         </w:rPr>
         <w:t xml:space="preserve">(e.g., digital numeric data, imagery, photographs, video, audio,</w:t>
       </w:r>
       <w:r>
         <w:rPr>
-          <w:i/>
-        </w:rPr>
-        <w:t xml:space="preserve"> </w:t>
-      </w:r>
-      <w:r>
-        <w:rPr>
+          <w:iCs/>
+          <w:i/>
+        </w:rPr>
+        <w:t xml:space="preserve"> </w:t>
+      </w:r>
+      <w:r>
+        <w:rPr>
+          <w:iCs/>
           <w:i/>
         </w:rPr>
         <w:t xml:space="preserve">database, tabular data, etc.)</w:t>
@@ -387,6 +413,7 @@
       </w:pPr>
       <w:r>
         <w:rPr>
+          <w:bCs/>
           <w:b/>
         </w:rPr>
         <w:t xml:space="preserve">Data collection method(s) and Standards:</w:t>
@@ -398,42 +425,49 @@
       </w:pPr>
       <w:r>
         <w:rPr>
+          <w:iCs/>
           <w:i/>
         </w:rPr>
         <w:t xml:space="preserve">(e.g., satellite, airplane, unmanned aerial system, radar, weather</w:t>
       </w:r>
       <w:r>
         <w:rPr>
-          <w:i/>
-        </w:rPr>
-        <w:t xml:space="preserve"> </w:t>
-      </w:r>
-      <w:r>
-        <w:rPr>
+          <w:iCs/>
+          <w:i/>
+        </w:rPr>
+        <w:t xml:space="preserve"> </w:t>
+      </w:r>
+      <w:r>
+        <w:rPr>
+          <w:iCs/>
           <w:i/>
         </w:rPr>
         <w:t xml:space="preserve">station, moored buoy, research vessel, autonomous underwater vehicle,</w:t>
       </w:r>
       <w:r>
         <w:rPr>
-          <w:i/>
-        </w:rPr>
-        <w:t xml:space="preserve"> </w:t>
-      </w:r>
-      <w:r>
-        <w:rPr>
+          <w:iCs/>
+          <w:i/>
+        </w:rPr>
+        <w:t xml:space="preserve"> </w:t>
+      </w:r>
+      <w:r>
+        <w:rPr>
+          <w:iCs/>
           <w:i/>
         </w:rPr>
         <w:t xml:space="preserve">animal tagging, manual surveys, enforcement activities, numerical</w:t>
       </w:r>
       <w:r>
         <w:rPr>
-          <w:i/>
-        </w:rPr>
-        <w:t xml:space="preserve"> </w:t>
-      </w:r>
-      <w:r>
-        <w:rPr>
+          <w:iCs/>
+          <w:i/>
+        </w:rPr>
+        <w:t xml:space="preserve"> </w:t>
+      </w:r>
+      <w:r>
+        <w:rPr>
+          <w:iCs/>
           <w:i/>
         </w:rPr>
         <w:t xml:space="preserve">model, etc.)</w:t>
@@ -475,6 +509,7 @@
       </w:pPr>
       <w:r>
         <w:rPr>
+          <w:bCs/>
           <w:b/>
         </w:rPr>
         <w:t xml:space="preserve">Detail the data collection methods, tools, and data types:</w:t>
@@ -498,18 +533,21 @@
       </w:pPr>
       <w:r>
         <w:rPr>
+          <w:bCs/>
           <w:b/>
         </w:rPr>
         <w:t xml:space="preserve">Establish standardized data formats, metadata, and naming &gt;</w:t>
       </w:r>
       <w:r>
         <w:rPr>
-          <w:b/>
-        </w:rPr>
-        <w:t xml:space="preserve"> </w:t>
-      </w:r>
-      <w:r>
-        <w:rPr>
+          <w:bCs/>
+          <w:b/>
+        </w:rPr>
+        <w:t xml:space="preserve"> </w:t>
+      </w:r>
+      <w:r>
+        <w:rPr>
+          <w:bCs/>
           <w:b/>
         </w:rPr>
         <w:t xml:space="preserve">conventions to ensure data compatibility:</w:t>
@@ -539,6 +577,7 @@
       </w:pPr>
       <w:r>
         <w:rPr>
+          <w:bCs/>
           <w:b/>
         </w:rPr>
         <w:t xml:space="preserve">If data are from a NOAA Observing System of Record</w:t>
@@ -546,24 +585,28 @@
       <w:r>
         <w:rPr>
           <w:vertAlign w:val="superscript"/>
+          <w:bCs/>
           <w:b/>
         </w:rPr>
         <w:t xml:space="preserve">15</w:t>
       </w:r>
       <w:r>
         <w:rPr>
+          <w:bCs/>
           <w:b/>
         </w:rPr>
         <w:t xml:space="preserve">,</w:t>
       </w:r>
       <w:r>
         <w:rPr>
-          <w:b/>
-        </w:rPr>
-        <w:t xml:space="preserve"> </w:t>
-      </w:r>
-      <w:r>
-        <w:rPr>
+          <w:bCs/>
+          <w:b/>
+        </w:rPr>
+        <w:t xml:space="preserve"> </w:t>
+      </w:r>
+      <w:r>
+        <w:rPr>
+          <w:bCs/>
           <w:b/>
         </w:rPr>
         <w:t xml:space="preserve">indicate &gt; name of system:</w:t>
@@ -593,6 +636,7 @@
       </w:pPr>
       <w:r>
         <w:rPr>
+          <w:bCs/>
           <w:b/>
         </w:rPr>
         <w:t xml:space="preserve">If data are from another observing system, please specify:</w:t>
@@ -615,6 +659,7 @@
       </w:pPr>
       <w:r>
         <w:rPr>
+          <w:bCs/>
           <w:b/>
         </w:rPr>
         <w:t xml:space="preserve">Data Storage, Security, and Privacy</w:t>
@@ -630,30 +675,35 @@
       </w:pPr>
       <w:r>
         <w:rPr>
+          <w:bCs/>
           <w:b/>
         </w:rPr>
         <w:t xml:space="preserve">Describe data storage infrastructure and security measures</w:t>
       </w:r>
       <w:r>
         <w:rPr>
-          <w:b/>
-        </w:rPr>
-        <w:t xml:space="preserve"> </w:t>
-      </w:r>
-      <w:r>
-        <w:rPr>
+          <w:bCs/>
+          <w:b/>
+        </w:rPr>
+        <w:t xml:space="preserve"> </w:t>
+      </w:r>
+      <w:r>
+        <w:rPr>
+          <w:bCs/>
           <w:b/>
         </w:rPr>
         <w:t xml:space="preserve">to &gt; protect sensitive or confidential data shared between &gt;</w:t>
       </w:r>
       <w:r>
         <w:rPr>
-          <w:b/>
-        </w:rPr>
-        <w:t xml:space="preserve"> </w:t>
-      </w:r>
-      <w:r>
-        <w:rPr>
+          <w:bCs/>
+          <w:b/>
+        </w:rPr>
+        <w:t xml:space="preserve"> </w:t>
+      </w:r>
+      <w:r>
+        <w:rPr>
+          <w:bCs/>
           <w:b/>
         </w:rPr>
         <w:t xml:space="preserve">organizations</w:t>
@@ -689,30 +739,35 @@
       </w:pPr>
       <w:r>
         <w:rPr>
+          <w:bCs/>
           <w:b/>
         </w:rPr>
         <w:t xml:space="preserve">Address data access controls and mechanisms to safeguard</w:t>
       </w:r>
       <w:r>
         <w:rPr>
-          <w:b/>
-        </w:rPr>
-        <w:t xml:space="preserve"> </w:t>
-      </w:r>
-      <w:r>
-        <w:rPr>
+          <w:bCs/>
+          <w:b/>
+        </w:rPr>
+        <w:t xml:space="preserve"> </w:t>
+      </w:r>
+      <w:r>
+        <w:rPr>
+          <w:bCs/>
           <w:b/>
         </w:rPr>
         <w:t xml:space="preserve">sensitive &gt; information and ensure compliance with data protection</w:t>
       </w:r>
       <w:r>
         <w:rPr>
-          <w:b/>
-        </w:rPr>
-        <w:t xml:space="preserve"> </w:t>
-      </w:r>
-      <w:r>
-        <w:rPr>
+          <w:bCs/>
+          <w:b/>
+        </w:rPr>
+        <w:t xml:space="preserve"> </w:t>
+      </w:r>
+      <w:r>
+        <w:rPr>
+          <w:bCs/>
           <w:b/>
         </w:rPr>
         <w:t xml:space="preserve">and privacy &gt; regulations</w:t>
@@ -747,18 +802,21 @@
       </w:pPr>
       <w:r>
         <w:rPr>
+          <w:bCs/>
           <w:b/>
         </w:rPr>
         <w:t xml:space="preserve">Point of Contact for this Data Management Plan (author or &gt;</w:t>
       </w:r>
       <w:r>
         <w:rPr>
-          <w:b/>
-        </w:rPr>
-        <w:t xml:space="preserve"> </w:t>
-      </w:r>
-      <w:r>
-        <w:rPr>
+          <w:bCs/>
+          <w:b/>
+        </w:rPr>
+        <w:t xml:space="preserve"> </w:t>
+      </w:r>
+      <w:r>
+        <w:rPr>
+          <w:bCs/>
           <w:b/>
         </w:rPr>
         <w:t xml:space="preserve">maintainer)</w:t>
@@ -774,6 +832,7 @@
       </w:pPr>
       <w:r>
         <w:rPr>
+          <w:bCs/>
           <w:b/>
         </w:rPr>
         <w:t xml:space="preserve">Name:</w:t>
@@ -797,6 +856,7 @@
       </w:pPr>
       <w:r>
         <w:rPr>
+          <w:bCs/>
           <w:b/>
         </w:rPr>
         <w:t xml:space="preserve">Title:</w:t>
@@ -820,6 +880,7 @@
       </w:pPr>
       <w:r>
         <w:rPr>
+          <w:bCs/>
           <w:b/>
         </w:rPr>
         <w:t xml:space="preserve">Affiliation or facility:</w:t>
@@ -843,6 +904,7 @@
       </w:pPr>
       <w:r>
         <w:rPr>
+          <w:bCs/>
           <w:b/>
         </w:rPr>
         <w:t xml:space="preserve">E-mail address:</w:t>
@@ -866,6 +928,7 @@
       </w:pPr>
       <w:r>
         <w:rPr>
+          <w:bCs/>
           <w:b/>
         </w:rPr>
         <w:t xml:space="preserve">Phone number:</w:t>
@@ -889,6 +952,7 @@
       </w:pPr>
       <w:r>
         <w:rPr>
+          <w:bCs/>
           <w:b/>
         </w:rPr>
         <w:t xml:space="preserve">Responsible Party for Data Management</w:t>
@@ -900,30 +964,35 @@
       </w:pPr>
       <w:r>
         <w:rPr>
+          <w:iCs/>
           <w:i/>
         </w:rPr>
         <w:t xml:space="preserve">Program Managers, or their designee, shall be responsible for</w:t>
       </w:r>
       <w:r>
         <w:rPr>
-          <w:i/>
-        </w:rPr>
-        <w:t xml:space="preserve"> </w:t>
-      </w:r>
-      <w:r>
-        <w:rPr>
+          <w:iCs/>
+          <w:i/>
+        </w:rPr>
+        <w:t xml:space="preserve"> </w:t>
+      </w:r>
+      <w:r>
+        <w:rPr>
+          <w:iCs/>
           <w:i/>
         </w:rPr>
         <w:t xml:space="preserve">assuring the proper management of the data produced by their Program.</w:t>
       </w:r>
       <w:r>
         <w:rPr>
-          <w:i/>
-        </w:rPr>
-        <w:t xml:space="preserve"> </w:t>
-      </w:r>
-      <w:r>
-        <w:rPr>
+          <w:iCs/>
+          <w:i/>
+        </w:rPr>
+        <w:t xml:space="preserve"> </w:t>
+      </w:r>
+      <w:r>
+        <w:rPr>
+          <w:iCs/>
           <w:i/>
         </w:rPr>
         <w:t xml:space="preserve">Please indicate the responsible party below.</w:t>
@@ -939,6 +1008,7 @@
       </w:pPr>
       <w:r>
         <w:rPr>
+          <w:bCs/>
           <w:b/>
         </w:rPr>
         <w:t xml:space="preserve">Name:</w:t>
@@ -962,6 +1032,7 @@
       </w:pPr>
       <w:r>
         <w:rPr>
+          <w:bCs/>
           <w:b/>
         </w:rPr>
         <w:t xml:space="preserve">Position Title:</w:t>
@@ -985,6 +1056,7 @@
       </w:pPr>
       <w:r>
         <w:rPr>
+          <w:bCs/>
           <w:b/>
         </w:rPr>
         <w:t xml:space="preserve">Name of Current Position Holder:</w:t>
@@ -1008,6 +1080,7 @@
       </w:pPr>
       <w:r>
         <w:rPr>
+          <w:bCs/>
           <w:b/>
         </w:rPr>
         <w:t xml:space="preserve">Resources</w:t>
@@ -1019,18 +1092,21 @@
       </w:pPr>
       <w:r>
         <w:rPr>
+          <w:iCs/>
           <w:i/>
         </w:rPr>
         <w:t xml:space="preserve">Programs must identify resources within their own budget for managing</w:t>
       </w:r>
       <w:r>
         <w:rPr>
-          <w:i/>
-        </w:rPr>
-        <w:t xml:space="preserve"> </w:t>
-      </w:r>
-      <w:r>
-        <w:rPr>
+          <w:iCs/>
+          <w:i/>
+        </w:rPr>
+        <w:t xml:space="preserve"> </w:t>
+      </w:r>
+      <w:r>
+        <w:rPr>
+          <w:iCs/>
           <w:i/>
         </w:rPr>
         <w:t xml:space="preserve">the data they produce.</w:t>
@@ -1046,6 +1122,7 @@
       </w:pPr>
       <w:r>
         <w:rPr>
+          <w:bCs/>
           <w:b/>
         </w:rPr>
         <w:t xml:space="preserve">Have resources for management of these data been identified?</w:t>
@@ -1069,18 +1146,21 @@
       </w:pPr>
       <w:r>
         <w:rPr>
+          <w:bCs/>
           <w:b/>
         </w:rPr>
         <w:t xml:space="preserve">Approximate percentage of the budget for these data devoted to &gt;</w:t>
       </w:r>
       <w:r>
         <w:rPr>
-          <w:b/>
-        </w:rPr>
-        <w:t xml:space="preserve"> </w:t>
-      </w:r>
-      <w:r>
-        <w:rPr>
+          <w:bCs/>
+          <w:b/>
+        </w:rPr>
+        <w:t xml:space="preserve"> </w:t>
+      </w:r>
+      <w:r>
+        <w:rPr>
+          <w:bCs/>
           <w:b/>
         </w:rPr>
         <w:t xml:space="preserve">data management (specify percentage or "unknown"):</w:t>
@@ -1110,6 +1190,7 @@
       </w:pPr>
       <w:r>
         <w:rPr>
+          <w:bCs/>
           <w:b/>
         </w:rPr>
         <w:t xml:space="preserve">Data Lineage and Quality</w:t>
@@ -1121,30 +1202,35 @@
       </w:pPr>
       <w:r>
         <w:rPr>
+          <w:iCs/>
           <w:i/>
         </w:rPr>
         <w:t xml:space="preserve">NOAA has issued Information Quality Guidelines for ensuring and</w:t>
       </w:r>
       <w:r>
         <w:rPr>
-          <w:i/>
-        </w:rPr>
-        <w:t xml:space="preserve"> </w:t>
-      </w:r>
-      <w:r>
-        <w:rPr>
+          <w:iCs/>
+          <w:i/>
+        </w:rPr>
+        <w:t xml:space="preserve"> </w:t>
+      </w:r>
+      <w:r>
+        <w:rPr>
+          <w:iCs/>
           <w:i/>
         </w:rPr>
         <w:t xml:space="preserve">maximizing the quality, objectivity, utility, and integrity of</w:t>
       </w:r>
       <w:r>
         <w:rPr>
-          <w:i/>
-        </w:rPr>
-        <w:t xml:space="preserve"> </w:t>
-      </w:r>
-      <w:r>
-        <w:rPr>
+          <w:iCs/>
+          <w:i/>
+        </w:rPr>
+        <w:t xml:space="preserve"> </w:t>
+      </w:r>
+      <w:r>
+        <w:rPr>
+          <w:iCs/>
           <w:i/>
         </w:rPr>
         <w:t xml:space="preserve">information which it disseminates.</w:t>
@@ -1160,18 +1246,21 @@
       </w:pPr>
       <w:r>
         <w:rPr>
+          <w:bCs/>
           <w:b/>
         </w:rPr>
         <w:t xml:space="preserve">Processing workflow of the data from collection or acquisition</w:t>
       </w:r>
       <w:r>
         <w:rPr>
-          <w:b/>
-        </w:rPr>
-        <w:t xml:space="preserve"> </w:t>
-      </w:r>
-      <w:r>
-        <w:rPr>
+          <w:bCs/>
+          <w:b/>
+        </w:rPr>
+        <w:t xml:space="preserve"> </w:t>
+      </w:r>
+      <w:r>
+        <w:rPr>
+          <w:bCs/>
           <w:b/>
         </w:rPr>
         <w:t xml:space="preserve">to &gt; making it publicly accessible</w:t>
@@ -1183,6 +1272,7 @@
       </w:pPr>
       <w:r>
         <w:rPr>
+          <w:iCs/>
           <w:i/>
         </w:rPr>
         <w:t xml:space="preserve">(describe or provide URL of description):</w:t>
@@ -1212,30 +1302,35 @@
       </w:pPr>
       <w:r>
         <w:rPr>
+          <w:bCs/>
           <w:b/>
         </w:rPr>
         <w:t xml:space="preserve">If data at different stages of the workflow, or products</w:t>
       </w:r>
       <w:r>
         <w:rPr>
-          <w:b/>
-        </w:rPr>
-        <w:t xml:space="preserve"> </w:t>
-      </w:r>
-      <w:r>
-        <w:rPr>
+          <w:bCs/>
+          <w:b/>
+        </w:rPr>
+        <w:t xml:space="preserve"> </w:t>
+      </w:r>
+      <w:r>
+        <w:rPr>
+          <w:bCs/>
           <w:b/>
         </w:rPr>
         <w:t xml:space="preserve">derived &gt; from these data, are subject to a separate data</w:t>
       </w:r>
       <w:r>
         <w:rPr>
-          <w:b/>
-        </w:rPr>
-        <w:t xml:space="preserve"> </w:t>
-      </w:r>
-      <w:r>
-        <w:rPr>
+          <w:bCs/>
+          <w:b/>
+        </w:rPr>
+        <w:t xml:space="preserve"> </w:t>
+      </w:r>
+      <w:r>
+        <w:rPr>
+          <w:bCs/>
           <w:b/>
         </w:rPr>
         <w:t xml:space="preserve">management plan, &gt; provide reference to other plan:</w:t>
@@ -1271,18 +1366,21 @@
       </w:pPr>
       <w:r>
         <w:rPr>
+          <w:bCs/>
           <w:b/>
         </w:rPr>
         <w:t xml:space="preserve">Quality control procedures employed (describe or provide URL of &gt;</w:t>
       </w:r>
       <w:r>
         <w:rPr>
-          <w:b/>
-        </w:rPr>
-        <w:t xml:space="preserve"> </w:t>
-      </w:r>
-      <w:r>
-        <w:rPr>
+          <w:bCs/>
+          <w:b/>
+        </w:rPr>
+        <w:t xml:space="preserve"> </w:t>
+      </w:r>
+      <w:r>
+        <w:rPr>
+          <w:bCs/>
           <w:b/>
         </w:rPr>
         <w:t xml:space="preserve">description):</w:t>
@@ -1312,6 +1410,7 @@
       </w:pPr>
       <w:r>
         <w:rPr>
+          <w:bCs/>
           <w:b/>
         </w:rPr>
         <w:t xml:space="preserve">Data Documentation</w:t>
@@ -1323,42 +1422,49 @@
       </w:pPr>
       <w:r>
         <w:rPr>
+          <w:iCs/>
           <w:i/>
         </w:rPr>
         <w:t xml:space="preserve">The EDMC Data Documentation Procedural Directive requires that NOAA</w:t>
       </w:r>
       <w:r>
         <w:rPr>
-          <w:i/>
-        </w:rPr>
-        <w:t xml:space="preserve"> </w:t>
-      </w:r>
-      <w:r>
-        <w:rPr>
+          <w:iCs/>
+          <w:i/>
+        </w:rPr>
+        <w:t xml:space="preserve"> </w:t>
+      </w:r>
+      <w:r>
+        <w:rPr>
+          <w:iCs/>
           <w:i/>
         </w:rPr>
         <w:t xml:space="preserve">data be well documented, specifies the use of ISO 19115 and related</w:t>
       </w:r>
       <w:r>
         <w:rPr>
-          <w:i/>
-        </w:rPr>
-        <w:t xml:space="preserve"> </w:t>
-      </w:r>
-      <w:r>
-        <w:rPr>
+          <w:iCs/>
+          <w:i/>
+        </w:rPr>
+        <w:t xml:space="preserve"> </w:t>
+      </w:r>
+      <w:r>
+        <w:rPr>
+          <w:iCs/>
           <w:i/>
         </w:rPr>
         <w:t xml:space="preserve">standards for documentation of new data, and provides links to</w:t>
       </w:r>
       <w:r>
         <w:rPr>
-          <w:i/>
-        </w:rPr>
-        <w:t xml:space="preserve"> </w:t>
-      </w:r>
-      <w:r>
-        <w:rPr>
+          <w:iCs/>
+          <w:i/>
+        </w:rPr>
+        <w:t xml:space="preserve"> </w:t>
+      </w:r>
+      <w:r>
+        <w:rPr>
+          <w:iCs/>
           <w:i/>
         </w:rPr>
         <w:t xml:space="preserve">resources and tools for metadata creation and validation.</w:t>
@@ -1374,6 +1480,7 @@
       </w:pPr>
       <w:r>
         <w:rPr>
+          <w:bCs/>
           <w:b/>
         </w:rPr>
         <w:t xml:space="preserve">Does metadata comply with EDMC Data Documentation directive?</w:t>
@@ -1397,6 +1504,7 @@
       </w:pPr>
       <w:r>
         <w:rPr>
+          <w:bCs/>
           <w:b/>
         </w:rPr>
         <w:t xml:space="preserve">If metadata are non-existent or non-compliant, please explain:</w:t>
@@ -1420,6 +1528,7 @@
       </w:pPr>
       <w:r>
         <w:rPr>
+          <w:bCs/>
           <w:b/>
         </w:rPr>
         <w:t xml:space="preserve">Name of organization or facility providing metadata hosting:</w:t>
@@ -1443,6 +1552,7 @@
       </w:pPr>
       <w:r>
         <w:rPr>
+          <w:bCs/>
           <w:b/>
         </w:rPr>
         <w:t xml:space="preserve">If service is needed for metadata hosting, please indicate:</w:t>
@@ -1466,6 +1576,7 @@
       </w:pPr>
       <w:r>
         <w:rPr>
+          <w:bCs/>
           <w:b/>
         </w:rPr>
         <w:t xml:space="preserve">URL of metadata folder or data catalog, if known:</w:t>
@@ -1489,6 +1600,7 @@
       </w:pPr>
       <w:r>
         <w:rPr>
+          <w:bCs/>
           <w:b/>
         </w:rPr>
         <w:t xml:space="preserve">Process for producing and maintaining metadata</w:t>
@@ -1500,6 +1612,7 @@
       </w:pPr>
       <w:r>
         <w:rPr>
+          <w:iCs/>
           <w:i/>
         </w:rPr>
         <w:t xml:space="preserve">(describe or provide URL of description):</w:t>
@@ -1523,6 +1636,7 @@
       </w:pPr>
       <w:r>
         <w:rPr>
+          <w:bCs/>
           <w:b/>
         </w:rPr>
         <w:t xml:space="preserve">Data Access</w:t>
@@ -1534,114 +1648,133 @@
       </w:pPr>
       <w:r>
         <w:rPr>
+          <w:iCs/>
           <w:i/>
         </w:rPr>
         <w:t xml:space="preserve">NAO 212-15 states that access to environmental data may only be</w:t>
       </w:r>
       <w:r>
         <w:rPr>
-          <w:i/>
-        </w:rPr>
-        <w:t xml:space="preserve"> </w:t>
-      </w:r>
-      <w:r>
-        <w:rPr>
+          <w:iCs/>
+          <w:i/>
+        </w:rPr>
+        <w:t xml:space="preserve"> </w:t>
+      </w:r>
+      <w:r>
+        <w:rPr>
+          <w:iCs/>
           <w:i/>
         </w:rPr>
         <w:t xml:space="preserve">restricted when distribution is explicitly limited by law, regulation,</w:t>
       </w:r>
       <w:r>
         <w:rPr>
-          <w:i/>
-        </w:rPr>
-        <w:t xml:space="preserve"> </w:t>
-      </w:r>
-      <w:r>
-        <w:rPr>
+          <w:iCs/>
+          <w:i/>
+        </w:rPr>
+        <w:t xml:space="preserve"> </w:t>
+      </w:r>
+      <w:r>
+        <w:rPr>
+          <w:iCs/>
           <w:i/>
         </w:rPr>
         <w:t xml:space="preserve">policy (such as those applicable to personally identifiable</w:t>
       </w:r>
       <w:r>
         <w:rPr>
-          <w:i/>
-        </w:rPr>
-        <w:t xml:space="preserve"> </w:t>
-      </w:r>
-      <w:r>
-        <w:rPr>
+          <w:iCs/>
+          <w:i/>
+        </w:rPr>
+        <w:t xml:space="preserve"> </w:t>
+      </w:r>
+      <w:r>
+        <w:rPr>
+          <w:iCs/>
           <w:i/>
         </w:rPr>
         <w:t xml:space="preserve">information or protected critical infrastructure information or</w:t>
       </w:r>
       <w:r>
         <w:rPr>
-          <w:i/>
-        </w:rPr>
-        <w:t xml:space="preserve"> </w:t>
-      </w:r>
-      <w:r>
-        <w:rPr>
+          <w:iCs/>
+          <w:i/>
+        </w:rPr>
+        <w:t xml:space="preserve"> </w:t>
+      </w:r>
+      <w:r>
+        <w:rPr>
+          <w:iCs/>
           <w:i/>
         </w:rPr>
         <w:t xml:space="preserve">proprietary trade information) or by security requirements. The EDMC</w:t>
       </w:r>
       <w:r>
         <w:rPr>
-          <w:i/>
-        </w:rPr>
-        <w:t xml:space="preserve"> </w:t>
-      </w:r>
-      <w:r>
-        <w:rPr>
+          <w:iCs/>
+          <w:i/>
+        </w:rPr>
+        <w:t xml:space="preserve"> </w:t>
+      </w:r>
+      <w:r>
+        <w:rPr>
+          <w:iCs/>
           <w:i/>
         </w:rPr>
         <w:t xml:space="preserve">Data Access Procedural Directive contains specific guidance,</w:t>
       </w:r>
       <w:r>
         <w:rPr>
-          <w:i/>
-        </w:rPr>
-        <w:t xml:space="preserve"> </w:t>
-      </w:r>
-      <w:r>
-        <w:rPr>
+          <w:iCs/>
+          <w:i/>
+        </w:rPr>
+        <w:t xml:space="preserve"> </w:t>
+      </w:r>
+      <w:r>
+        <w:rPr>
+          <w:iCs/>
           <w:i/>
         </w:rPr>
         <w:t xml:space="preserve">recommends the use of open-standard, interoperable, non-proprietary</w:t>
       </w:r>
       <w:r>
         <w:rPr>
-          <w:i/>
-        </w:rPr>
-        <w:t xml:space="preserve"> </w:t>
-      </w:r>
-      <w:r>
-        <w:rPr>
+          <w:iCs/>
+          <w:i/>
+        </w:rPr>
+        <w:t xml:space="preserve"> </w:t>
+      </w:r>
+      <w:r>
+        <w:rPr>
+          <w:iCs/>
           <w:i/>
         </w:rPr>
         <w:t xml:space="preserve">web services, provides information about resources and tools to enable</w:t>
       </w:r>
       <w:r>
         <w:rPr>
-          <w:i/>
-        </w:rPr>
-        <w:t xml:space="preserve"> </w:t>
-      </w:r>
-      <w:r>
-        <w:rPr>
+          <w:iCs/>
+          <w:i/>
+        </w:rPr>
+        <w:t xml:space="preserve"> </w:t>
+      </w:r>
+      <w:r>
+        <w:rPr>
+          <w:iCs/>
           <w:i/>
         </w:rPr>
         <w:t xml:space="preserve">data access, and includes a Waiver to be submitted to justify any</w:t>
       </w:r>
       <w:r>
         <w:rPr>
-          <w:i/>
-        </w:rPr>
-        <w:t xml:space="preserve"> </w:t>
-      </w:r>
-      <w:r>
-        <w:rPr>
+          <w:iCs/>
+          <w:i/>
+        </w:rPr>
+        <w:t xml:space="preserve"> </w:t>
+      </w:r>
+      <w:r>
+        <w:rPr>
+          <w:iCs/>
           <w:i/>
         </w:rPr>
         <w:t xml:space="preserve">approach other than full, unrestricted public access.</w:t>
@@ -1657,6 +1790,7 @@
       </w:pPr>
       <w:r>
         <w:rPr>
+          <w:bCs/>
           <w:b/>
         </w:rPr>
         <w:t xml:space="preserve">Do these data comply with the Data Access directive?</w:t>
@@ -1680,30 +1814,35 @@
       </w:pPr>
       <w:r>
         <w:rPr>
+          <w:bCs/>
           <w:b/>
         </w:rPr>
         <w:t xml:space="preserve">If the data are not to be made available to the public at all,</w:t>
       </w:r>
       <w:r>
         <w:rPr>
-          <w:b/>
-        </w:rPr>
-        <w:t xml:space="preserve"> </w:t>
-      </w:r>
-      <w:r>
-        <w:rPr>
+          <w:bCs/>
+          <w:b/>
+        </w:rPr>
+        <w:t xml:space="preserve"> </w:t>
+      </w:r>
+      <w:r>
+        <w:rPr>
+          <w:bCs/>
           <w:b/>
         </w:rPr>
         <w:t xml:space="preserve">or &gt; with limitations, has a Waiver (Appendix A of Data Access &gt;</w:t>
       </w:r>
       <w:r>
         <w:rPr>
-          <w:b/>
-        </w:rPr>
-        <w:t xml:space="preserve"> </w:t>
-      </w:r>
-      <w:r>
-        <w:rPr>
+          <w:bCs/>
+          <w:b/>
+        </w:rPr>
+        <w:t xml:space="preserve"> </w:t>
+      </w:r>
+      <w:r>
+        <w:rPr>
+          <w:bCs/>
           <w:b/>
         </w:rPr>
         <w:t xml:space="preserve">directive) been filed?</w:t>
@@ -1739,18 +1878,21 @@
       </w:pPr>
       <w:r>
         <w:rPr>
+          <w:bCs/>
           <w:b/>
         </w:rPr>
         <w:t xml:space="preserve">If there are limitations to public data access, describe how</w:t>
       </w:r>
       <w:r>
         <w:rPr>
-          <w:b/>
-        </w:rPr>
-        <w:t xml:space="preserve"> </w:t>
-      </w:r>
-      <w:r>
-        <w:rPr>
+          <w:bCs/>
+          <w:b/>
+        </w:rPr>
+        <w:t xml:space="preserve"> </w:t>
+      </w:r>
+      <w:r>
+        <w:rPr>
+          <w:bCs/>
           <w:b/>
         </w:rPr>
         <w:t xml:space="preserve">data &gt; are protected from unauthorized access or disclosure:</w:t>
@@ -1780,6 +1922,7 @@
       </w:pPr>
       <w:r>
         <w:rPr>
+          <w:bCs/>
           <w:b/>
         </w:rPr>
         <w:t xml:space="preserve">Name of organization of facility providing data access:</w:t>
@@ -1803,6 +1946,7 @@
       </w:pPr>
       <w:r>
         <w:rPr>
+          <w:bCs/>
           <w:b/>
         </w:rPr>
         <w:t xml:space="preserve">If data hosting service is needed, please indicate:</w:t>
@@ -1826,6 +1970,7 @@
       </w:pPr>
       <w:r>
         <w:rPr>
+          <w:bCs/>
           <w:b/>
         </w:rPr>
         <w:t xml:space="preserve">URL of data access service, if known:</w:t>
@@ -1849,6 +1994,7 @@
       </w:pPr>
       <w:r>
         <w:rPr>
+          <w:bCs/>
           <w:b/>
         </w:rPr>
         <w:t xml:space="preserve">Data access methods or services offered:</w:t>
@@ -1872,6 +2018,7 @@
       </w:pPr>
       <w:r>
         <w:rPr>
+          <w:bCs/>
           <w:b/>
         </w:rPr>
         <w:t xml:space="preserve">Approximate delay between data collection and dissemination:</w:t>
@@ -1895,18 +2042,21 @@
       </w:pPr>
       <w:r>
         <w:rPr>
+          <w:bCs/>
           <w:b/>
         </w:rPr>
         <w:t xml:space="preserve">If delay is longer than latency of automated processing,</w:t>
       </w:r>
       <w:r>
         <w:rPr>
-          <w:b/>
-        </w:rPr>
-        <w:t xml:space="preserve"> </w:t>
-      </w:r>
-      <w:r>
-        <w:rPr>
+          <w:bCs/>
+          <w:b/>
+        </w:rPr>
+        <w:t xml:space="preserve"> </w:t>
+      </w:r>
+      <w:r>
+        <w:rPr>
+          <w:bCs/>
           <w:b/>
         </w:rPr>
         <w:t xml:space="preserve">indicate &gt; under what authority data access is delayed:</w:t>
@@ -1936,6 +2086,7 @@
       </w:pPr>
       <w:r>
         <w:rPr>
+          <w:bCs/>
           <w:b/>
         </w:rPr>
         <w:t xml:space="preserve">Data Preservation and Protection</w:t>
@@ -1947,30 +2098,35 @@
       </w:pPr>
       <w:r>
         <w:rPr>
+          <w:iCs/>
           <w:i/>
         </w:rPr>
         <w:t xml:space="preserve">The NOAA Procedure for Scientific Records Appraisal and Archive</w:t>
       </w:r>
       <w:r>
         <w:rPr>
-          <w:i/>
-        </w:rPr>
-        <w:t xml:space="preserve"> </w:t>
-      </w:r>
-      <w:r>
-        <w:rPr>
+          <w:iCs/>
+          <w:i/>
+        </w:rPr>
+        <w:t xml:space="preserve"> </w:t>
+      </w:r>
+      <w:r>
+        <w:rPr>
+          <w:iCs/>
           <w:i/>
         </w:rPr>
         <w:t xml:space="preserve">Approval describes how to identify, appraise and decide what</w:t>
       </w:r>
       <w:r>
         <w:rPr>
-          <w:i/>
-        </w:rPr>
-        <w:t xml:space="preserve"> </w:t>
-      </w:r>
-      <w:r>
-        <w:rPr>
+          <w:iCs/>
+          <w:i/>
+        </w:rPr>
+        <w:t xml:space="preserve"> </w:t>
+      </w:r>
+      <w:r>
+        <w:rPr>
+          <w:iCs/>
           <w:i/>
         </w:rPr>
         <w:t xml:space="preserve">scientific records are to be preserved in a NOAA archive.</w:t>
@@ -1986,6 +2142,7 @@
       </w:pPr>
       <w:r>
         <w:rPr>
+          <w:bCs/>
           <w:b/>
         </w:rPr>
         <w:t xml:space="preserve">Actual or planned long-term data archive location:</w:t>
@@ -1997,30 +2154,35 @@
       </w:pPr>
       <w:r>
         <w:rPr>
+          <w:iCs/>
           <w:i/>
         </w:rPr>
         <w:t xml:space="preserve">(Specify NCEI-MD, NCEI-CO, NCEI-NC, NCEI-MS, World Data Center (WDC)</w:t>
       </w:r>
       <w:r>
         <w:rPr>
-          <w:i/>
-        </w:rPr>
-        <w:t xml:space="preserve"> </w:t>
-      </w:r>
-      <w:r>
-        <w:rPr>
+          <w:iCs/>
+          <w:i/>
+        </w:rPr>
+        <w:t xml:space="preserve"> </w:t>
+      </w:r>
+      <w:r>
+        <w:rPr>
+          <w:iCs/>
           <w:i/>
         </w:rPr>
         <w:t xml:space="preserve">facility, Other, To Be Determined, Unable to Archive, or No Archiving</w:t>
       </w:r>
       <w:r>
         <w:rPr>
-          <w:i/>
-        </w:rPr>
-        <w:t xml:space="preserve"> </w:t>
-      </w:r>
-      <w:r>
-        <w:rPr>
+          <w:iCs/>
+          <w:i/>
+        </w:rPr>
+        <w:t xml:space="preserve"> </w:t>
+      </w:r>
+      <w:r>
+        <w:rPr>
+          <w:iCs/>
           <w:i/>
         </w:rPr>
         <w:t xml:space="preserve">Intended)</w:t>
@@ -2044,6 +2206,7 @@
       </w:pPr>
       <w:r>
         <w:rPr>
+          <w:bCs/>
           <w:b/>
         </w:rPr>
         <w:t xml:space="preserve">If World Data Center or Other, specify:</w:t>
@@ -2067,18 +2230,21 @@
       </w:pPr>
       <w:r>
         <w:rPr>
+          <w:bCs/>
           <w:b/>
         </w:rPr>
         <w:t xml:space="preserve">If To Be Determined, Unable to Archive or No Archiving</w:t>
       </w:r>
       <w:r>
         <w:rPr>
-          <w:b/>
-        </w:rPr>
-        <w:t xml:space="preserve"> </w:t>
-      </w:r>
-      <w:r>
-        <w:rPr>
+          <w:bCs/>
+          <w:b/>
+        </w:rPr>
+        <w:t xml:space="preserve"> </w:t>
+      </w:r>
+      <w:r>
+        <w:rPr>
+          <w:bCs/>
           <w:b/>
         </w:rPr>
         <w:t xml:space="preserve">Intended, &gt; explain:</w:t>
@@ -2108,18 +2274,21 @@
       </w:pPr>
       <w:r>
         <w:rPr>
+          <w:bCs/>
           <w:b/>
         </w:rPr>
         <w:t xml:space="preserve">Data storage facility prior to being sent to an archive</w:t>
       </w:r>
       <w:r>
         <w:rPr>
-          <w:b/>
-        </w:rPr>
-        <w:t xml:space="preserve"> </w:t>
-      </w:r>
-      <w:r>
-        <w:rPr>
+          <w:bCs/>
+          <w:b/>
+        </w:rPr>
+        <w:t xml:space="preserve"> </w:t>
+      </w:r>
+      <w:r>
+        <w:rPr>
+          <w:bCs/>
           <w:b/>
         </w:rPr>
         <w:t xml:space="preserve">facility &gt; (if any):</w:t>
@@ -2149,18 +2318,21 @@
       </w:pPr>
       <w:r>
         <w:rPr>
+          <w:bCs/>
           <w:b/>
         </w:rPr>
         <w:t xml:space="preserve">Approximate delay between data collection and submission to an &gt;</w:t>
       </w:r>
       <w:r>
         <w:rPr>
-          <w:b/>
-        </w:rPr>
-        <w:t xml:space="preserve"> </w:t>
-      </w:r>
-      <w:r>
-        <w:rPr>
+          <w:bCs/>
+          <w:b/>
+        </w:rPr>
+        <w:t xml:space="preserve"> </w:t>
+      </w:r>
+      <w:r>
+        <w:rPr>
+          <w:bCs/>
           <w:b/>
         </w:rPr>
         <w:t xml:space="preserve">archive facility:</w:t>
@@ -2190,18 +2362,21 @@
       </w:pPr>
       <w:r>
         <w:rPr>
+          <w:bCs/>
           <w:b/>
         </w:rPr>
         <w:t xml:space="preserve">How will the data be protected from accidental or malicious &gt;</w:t>
       </w:r>
       <w:r>
         <w:rPr>
-          <w:b/>
-        </w:rPr>
-        <w:t xml:space="preserve"> </w:t>
-      </w:r>
-      <w:r>
-        <w:rPr>
+          <w:bCs/>
+          <w:b/>
+        </w:rPr>
+        <w:t xml:space="preserve"> </w:t>
+      </w:r>
+      <w:r>
+        <w:rPr>
+          <w:bCs/>
           <w:b/>
         </w:rPr>
         <w:t xml:space="preserve">modification or deletion prior to receipt by the archive?</w:t>
@@ -2213,18 +2388,21 @@
       </w:pPr>
       <w:r>
         <w:rPr>
+          <w:iCs/>
           <w:i/>
         </w:rPr>
         <w:t xml:space="preserve">Discuss data back-up, disaster recovery/contingency planning, and</w:t>
       </w:r>
       <w:r>
         <w:rPr>
-          <w:i/>
-        </w:rPr>
-        <w:t xml:space="preserve"> </w:t>
-      </w:r>
-      <w:r>
-        <w:rPr>
+          <w:iCs/>
+          <w:i/>
+        </w:rPr>
+        <w:t xml:space="preserve"> </w:t>
+      </w:r>
+      <w:r>
+        <w:rPr>
+          <w:iCs/>
           <w:i/>
         </w:rPr>
         <w:t xml:space="preserve">off-site data storage relevant to the data collection</w:t>
@@ -2254,6 +2432,7 @@
       </w:pPr>
       <w:r>
         <w:rPr>
+          <w:bCs/>
           <w:b/>
         </w:rPr>
         <w:t xml:space="preserve">Additional Line Office or Staff Office Questions</w:t>
@@ -2265,18 +2444,21 @@
       </w:pPr>
       <w:r>
         <w:rPr>
+          <w:iCs/>
           <w:i/>
         </w:rPr>
         <w:t xml:space="preserve">Line and Staff Offices may extend this template by inserting</w:t>
       </w:r>
       <w:r>
         <w:rPr>
-          <w:i/>
-        </w:rPr>
-        <w:t xml:space="preserve"> </w:t>
-      </w:r>
-      <w:r>
-        <w:rPr>
+          <w:iCs/>
+          <w:i/>
+        </w:rPr>
+        <w:t xml:space="preserve"> </w:t>
+      </w:r>
+      <w:r>
+        <w:rPr>
+          <w:iCs/>
           <w:i/>
         </w:rPr>
         <w:t xml:space="preserve">additional questions in this section.</w:t>
@@ -2313,17 +2495,14 @@
 <file path=word/numbering.xml><?xml version="1.0" encoding="utf-8"?>
 <w:numbering xmlns:w="http://schemas.openxmlformats.org/wordprocessingml/2006/main">
   <w:abstractNum w:abstractNumId="990">
-    <w:nsid w:val="2c1ae401"/>
+    <w:nsid w:val="A990"/>
     <w:multiLevelType w:val="multilevel"/>
     <w:lvl w:ilvl="0">
       <w:numFmt w:val="bullet"/>
       <w:lvlText w:val=" "/>
       <w:lvlJc w:val="left"/>
       <w:pPr>
-        <w:tabs>
-          <w:tab w:val="num" w:pos="0"/>
-        </w:tabs>
-        <w:ind w:left="480" w:hanging="480"/>
+        <w:ind w:left="720" w:hanging="480"/>
       </w:pPr>
     </w:lvl>
     <w:lvl w:ilvl="1">
@@ -2331,10 +2510,7 @@
       <w:lvlText w:val=" "/>
       <w:lvlJc w:val="left"/>
       <w:pPr>
-        <w:tabs>
-          <w:tab w:val="num" w:pos="720"/>
-        </w:tabs>
-        <w:ind w:left="1200" w:hanging="480"/>
+        <w:ind w:left="1440" w:hanging="480"/>
       </w:pPr>
     </w:lvl>
     <w:lvl w:ilvl="2">
@@ -2342,10 +2518,7 @@
       <w:lvlText w:val=" "/>
       <w:lvlJc w:val="left"/>
       <w:pPr>
-        <w:tabs>
-          <w:tab w:val="num" w:pos="1440"/>
-        </w:tabs>
-        <w:ind w:left="1920" w:hanging="480"/>
+        <w:ind w:left="2160" w:hanging="480"/>
       </w:pPr>
     </w:lvl>
     <w:lvl w:ilvl="3">
@@ -2353,10 +2526,7 @@
       <w:lvlText w:val=" "/>
       <w:lvlJc w:val="left"/>
       <w:pPr>
-        <w:tabs>
-          <w:tab w:val="num" w:pos="2160"/>
-        </w:tabs>
-        <w:ind w:left="2640" w:hanging="480"/>
+        <w:ind w:left="2880" w:hanging="480"/>
       </w:pPr>
     </w:lvl>
     <w:lvl w:ilvl="4">
@@ -2364,10 +2534,7 @@
       <w:lvlText w:val=" "/>
       <w:lvlJc w:val="left"/>
       <w:pPr>
-        <w:tabs>
-          <w:tab w:val="num" w:pos="2880"/>
-        </w:tabs>
-        <w:ind w:left="3360" w:hanging="480"/>
+        <w:ind w:left="3600" w:hanging="480"/>
       </w:pPr>
     </w:lvl>
     <w:lvl w:ilvl="5">
@@ -2375,10 +2542,7 @@
       <w:lvlText w:val=" "/>
       <w:lvlJc w:val="left"/>
       <w:pPr>
-        <w:tabs>
-          <w:tab w:val="num" w:pos="3600"/>
-        </w:tabs>
-        <w:ind w:left="4080" w:hanging="480"/>
+        <w:ind w:left="4320" w:hanging="480"/>
       </w:pPr>
     </w:lvl>
     <w:lvl w:ilvl="6">
@@ -2386,10 +2550,7 @@
       <w:lvlText w:val=" "/>
       <w:lvlJc w:val="left"/>
       <w:pPr>
-        <w:tabs>
-          <w:tab w:val="num" w:pos="4320"/>
-        </w:tabs>
-        <w:ind w:left="4800" w:hanging="480"/>
+        <w:ind w:left="5040" w:hanging="480"/>
       </w:pPr>
     </w:lvl>
     <w:lvl w:ilvl="7">
@@ -2397,10 +2558,7 @@
       <w:lvlText w:val=" "/>
       <w:lvlJc w:val="left"/>
       <w:pPr>
-        <w:tabs>
-          <w:tab w:val="num" w:pos="5040"/>
-        </w:tabs>
-        <w:ind w:left="5520" w:hanging="480"/>
+        <w:ind w:left="5760" w:hanging="480"/>
       </w:pPr>
     </w:lvl>
     <w:lvl w:ilvl="8">
@@ -2408,25 +2566,19 @@
       <w:lvlText w:val=" "/>
       <w:lvlJc w:val="left"/>
       <w:pPr>
-        <w:tabs>
-          <w:tab w:val="num" w:pos="5760"/>
-        </w:tabs>
-        <w:ind w:left="6240" w:hanging="480"/>
+        <w:ind w:left="6480" w:hanging="480"/>
       </w:pPr>
     </w:lvl>
   </w:abstractNum>
   <w:abstractNum w:abstractNumId="991">
-    <w:nsid w:val="ea454b4c"/>
+    <w:nsid w:val="A991"/>
     <w:multiLevelType w:val="multilevel"/>
     <w:lvl w:ilvl="0">
       <w:numFmt w:val="bullet"/>
       <w:lvlText w:val="•"/>
       <w:lvlJc w:val="left"/>
       <w:pPr>
-        <w:tabs>
-          <w:tab w:val="num" w:pos="0"/>
-        </w:tabs>
-        <w:ind w:left="480" w:hanging="480"/>
+        <w:ind w:left="720" w:hanging="480"/>
       </w:pPr>
     </w:lvl>
     <w:lvl w:ilvl="1">
@@ -2434,10 +2586,7 @@
       <w:lvlText w:val="–"/>
       <w:lvlJc w:val="left"/>
       <w:pPr>
-        <w:tabs>
-          <w:tab w:val="num" w:pos="720"/>
-        </w:tabs>
-        <w:ind w:left="1200" w:hanging="480"/>
+        <w:ind w:left="1440" w:hanging="480"/>
       </w:pPr>
     </w:lvl>
     <w:lvl w:ilvl="2">
@@ -2445,10 +2594,7 @@
       <w:lvlText w:val="•"/>
       <w:lvlJc w:val="left"/>
       <w:pPr>
-        <w:tabs>
-          <w:tab w:val="num" w:pos="1440"/>
-        </w:tabs>
-        <w:ind w:left="1920" w:hanging="480"/>
+        <w:ind w:left="2160" w:hanging="480"/>
       </w:pPr>
     </w:lvl>
     <w:lvl w:ilvl="3">
@@ -2456,10 +2602,7 @@
       <w:lvlText w:val="–"/>
       <w:lvlJc w:val="left"/>
       <w:pPr>
-        <w:tabs>
-          <w:tab w:val="num" w:pos="2160"/>
-        </w:tabs>
-        <w:ind w:left="2640" w:hanging="480"/>
+        <w:ind w:left="2880" w:hanging="480"/>
       </w:pPr>
     </w:lvl>
     <w:lvl w:ilvl="4">
@@ -2467,10 +2610,7 @@
       <w:lvlText w:val="•"/>
       <w:lvlJc w:val="left"/>
       <w:pPr>
-        <w:tabs>
-          <w:tab w:val="num" w:pos="2880"/>
-        </w:tabs>
-        <w:ind w:left="3360" w:hanging="480"/>
+        <w:ind w:left="3600" w:hanging="480"/>
       </w:pPr>
     </w:lvl>
     <w:lvl w:ilvl="5">
@@ -2478,10 +2618,7 @@
       <w:lvlText w:val="–"/>
       <w:lvlJc w:val="left"/>
       <w:pPr>
-        <w:tabs>
-          <w:tab w:val="num" w:pos="3600"/>
-        </w:tabs>
-        <w:ind w:left="4080" w:hanging="480"/>
+        <w:ind w:left="4320" w:hanging="480"/>
       </w:pPr>
     </w:lvl>
     <w:lvl w:ilvl="6">
@@ -2489,10 +2626,7 @@
       <w:lvlText w:val="•"/>
       <w:lvlJc w:val="left"/>
       <w:pPr>
-        <w:tabs>
-          <w:tab w:val="num" w:pos="4320"/>
-        </w:tabs>
-        <w:ind w:left="4800" w:hanging="480"/>
+        <w:ind w:left="5040" w:hanging="480"/>
       </w:pPr>
     </w:lvl>
     <w:lvl w:ilvl="7">
@@ -2500,10 +2634,7 @@
       <w:lvlText w:val="–"/>
       <w:lvlJc w:val="left"/>
       <w:pPr>
-        <w:tabs>
-          <w:tab w:val="num" w:pos="5040"/>
-        </w:tabs>
-        <w:ind w:left="5520" w:hanging="480"/>
+        <w:ind w:left="5760" w:hanging="480"/>
       </w:pPr>
     </w:lvl>
     <w:lvl w:ilvl="8">
@@ -2511,15 +2642,12 @@
       <w:lvlText w:val="•"/>
       <w:lvlJc w:val="left"/>
       <w:pPr>
-        <w:tabs>
-          <w:tab w:val="num" w:pos="5760"/>
-        </w:tabs>
-        <w:ind w:left="6240" w:hanging="480"/>
+        <w:ind w:left="6480" w:hanging="480"/>
       </w:pPr>
     </w:lvl>
   </w:abstractNum>
   <w:abstractNum w:abstractNumId="99411">
-    <w:nsid w:val="71315dca"/>
+    <w:nsid w:val="A99411"/>
     <w:multiLevelType w:val="multilevel"/>
     <w:lvl w:ilvl="0">
       <w:start w:val="1"/>
@@ -2527,10 +2655,7 @@
       <w:lvlText w:val="%1."/>
       <w:lvlJc w:val="left"/>
       <w:pPr>
-        <w:tabs>
-          <w:tab w:val="num" w:pos="0"/>
-        </w:tabs>
-        <w:ind w:left="480" w:hanging="480"/>
+        <w:ind w:left="720" w:hanging="480"/>
       </w:pPr>
     </w:lvl>
     <w:lvl w:ilvl="1">
@@ -2539,10 +2664,7 @@
       <w:lvlText w:val="%2."/>
       <w:lvlJc w:val="left"/>
       <w:pPr>
-        <w:tabs>
-          <w:tab w:val="num" w:pos="720"/>
-        </w:tabs>
-        <w:ind w:left="1200" w:hanging="480"/>
+        <w:ind w:left="1440" w:hanging="480"/>
       </w:pPr>
     </w:lvl>
     <w:lvl w:ilvl="2">
@@ -2551,10 +2673,7 @@
       <w:lvlText w:val="%3."/>
       <w:lvlJc w:val="left"/>
       <w:pPr>
-        <w:tabs>
-          <w:tab w:val="num" w:pos="1440"/>
-        </w:tabs>
-        <w:ind w:left="1920" w:hanging="480"/>
+        <w:ind w:left="2160" w:hanging="480"/>
       </w:pPr>
     </w:lvl>
     <w:lvl w:ilvl="3">
@@ -2563,10 +2682,7 @@
       <w:lvlText w:val="%4."/>
       <w:lvlJc w:val="left"/>
       <w:pPr>
-        <w:tabs>
-          <w:tab w:val="num" w:pos="2160"/>
-        </w:tabs>
-        <w:ind w:left="2640" w:hanging="480"/>
+        <w:ind w:left="2880" w:hanging="480"/>
       </w:pPr>
     </w:lvl>
     <w:lvl w:ilvl="4">
@@ -2575,10 +2691,7 @@
       <w:lvlText w:val="%5."/>
       <w:lvlJc w:val="left"/>
       <w:pPr>
-        <w:tabs>
-          <w:tab w:val="num" w:pos="2880"/>
-        </w:tabs>
-        <w:ind w:left="3360" w:hanging="480"/>
+        <w:ind w:left="3600" w:hanging="480"/>
       </w:pPr>
     </w:lvl>
     <w:lvl w:ilvl="5">
@@ -2587,10 +2700,7 @@
       <w:lvlText w:val="%6."/>
       <w:lvlJc w:val="left"/>
       <w:pPr>
-        <w:tabs>
-          <w:tab w:val="num" w:pos="3600"/>
-        </w:tabs>
-        <w:ind w:left="4080" w:hanging="480"/>
+        <w:ind w:left="4320" w:hanging="480"/>
       </w:pPr>
     </w:lvl>
     <w:lvl w:ilvl="6">
@@ -2599,10 +2709,7 @@
       <w:lvlText w:val="%7."/>
       <w:lvlJc w:val="left"/>
       <w:pPr>
-        <w:tabs>
-          <w:tab w:val="num" w:pos="4320"/>
-        </w:tabs>
-        <w:ind w:left="4800" w:hanging="480"/>
+        <w:ind w:left="5040" w:hanging="480"/>
       </w:pPr>
     </w:lvl>
     <w:lvl w:ilvl="7">
@@ -2611,10 +2718,7 @@
       <w:lvlText w:val="%8."/>
       <w:lvlJc w:val="left"/>
       <w:pPr>
-        <w:tabs>
-          <w:tab w:val="num" w:pos="5040"/>
-        </w:tabs>
-        <w:ind w:left="5520" w:hanging="480"/>
+        <w:ind w:left="5760" w:hanging="480"/>
       </w:pPr>
     </w:lvl>
     <w:lvl w:ilvl="8">
@@ -2623,15 +2727,12 @@
       <w:lvlText w:val="%9."/>
       <w:lvlJc w:val="left"/>
       <w:pPr>
-        <w:tabs>
-          <w:tab w:val="num" w:pos="5760"/>
-        </w:tabs>
-        <w:ind w:left="6240" w:hanging="480"/>
+        <w:ind w:left="6480" w:hanging="480"/>
       </w:pPr>
     </w:lvl>
   </w:abstractNum>
   <w:abstractNum w:abstractNumId="99412">
-    <w:nsid w:val="47261bad"/>
+    <w:nsid w:val="A99412"/>
     <w:multiLevelType w:val="multilevel"/>
     <w:lvl w:ilvl="0">
       <w:start w:val="2"/>
@@ -2639,10 +2740,7 @@
       <w:lvlText w:val="%1."/>
       <w:lvlJc w:val="left"/>
       <w:pPr>
-        <w:tabs>
-          <w:tab w:val="num" w:pos="0"/>
-        </w:tabs>
-        <w:ind w:left="480" w:hanging="480"/>
+        <w:ind w:left="720" w:hanging="480"/>
       </w:pPr>
     </w:lvl>
     <w:lvl w:ilvl="1">
@@ -2651,10 +2749,7 @@
       <w:lvlText w:val="%2."/>
       <w:lvlJc w:val="left"/>
       <w:pPr>
-        <w:tabs>
-          <w:tab w:val="num" w:pos="720"/>
-        </w:tabs>
-        <w:ind w:left="1200" w:hanging="480"/>
+        <w:ind w:left="1440" w:hanging="480"/>
       </w:pPr>
     </w:lvl>
     <w:lvl w:ilvl="2">
@@ -2663,10 +2758,7 @@
       <w:lvlText w:val="%3."/>
       <w:lvlJc w:val="left"/>
       <w:pPr>
-        <w:tabs>
-          <w:tab w:val="num" w:pos="1440"/>
-        </w:tabs>
-        <w:ind w:left="1920" w:hanging="480"/>
+        <w:ind w:left="2160" w:hanging="480"/>
       </w:pPr>
     </w:lvl>
     <w:lvl w:ilvl="3">
@@ -2675,10 +2767,7 @@
       <w:lvlText w:val="%4."/>
       <w:lvlJc w:val="left"/>
       <w:pPr>
-        <w:tabs>
-          <w:tab w:val="num" w:pos="2160"/>
-        </w:tabs>
-        <w:ind w:left="2640" w:hanging="480"/>
+        <w:ind w:left="2880" w:hanging="480"/>
       </w:pPr>
     </w:lvl>
     <w:lvl w:ilvl="4">
@@ -2687,10 +2776,7 @@
       <w:lvlText w:val="%5."/>
       <w:lvlJc w:val="left"/>
       <w:pPr>
-        <w:tabs>
-          <w:tab w:val="num" w:pos="2880"/>
-        </w:tabs>
-        <w:ind w:left="3360" w:hanging="480"/>
+        <w:ind w:left="3600" w:hanging="480"/>
       </w:pPr>
     </w:lvl>
     <w:lvl w:ilvl="5">
@@ -2699,10 +2785,7 @@
       <w:lvlText w:val="%6."/>
       <w:lvlJc w:val="left"/>
       <w:pPr>
-        <w:tabs>
-          <w:tab w:val="num" w:pos="3600"/>
-        </w:tabs>
-        <w:ind w:left="4080" w:hanging="480"/>
+        <w:ind w:left="4320" w:hanging="480"/>
       </w:pPr>
     </w:lvl>
     <w:lvl w:ilvl="6">
@@ -2711,10 +2794,7 @@
       <w:lvlText w:val="%7."/>
       <w:lvlJc w:val="left"/>
       <w:pPr>
-        <w:tabs>
-          <w:tab w:val="num" w:pos="4320"/>
-        </w:tabs>
-        <w:ind w:left="4800" w:hanging="480"/>
+        <w:ind w:left="5040" w:hanging="480"/>
       </w:pPr>
     </w:lvl>
     <w:lvl w:ilvl="7">
@@ -2723,10 +2803,7 @@
       <w:lvlText w:val="%8."/>
       <w:lvlJc w:val="left"/>
       <w:pPr>
-        <w:tabs>
-          <w:tab w:val="num" w:pos="5040"/>
-        </w:tabs>
-        <w:ind w:left="5520" w:hanging="480"/>
+        <w:ind w:left="5760" w:hanging="480"/>
       </w:pPr>
     </w:lvl>
     <w:lvl w:ilvl="8">
@@ -2735,15 +2812,12 @@
       <w:lvlText w:val="%9."/>
       <w:lvlJc w:val="left"/>
       <w:pPr>
-        <w:tabs>
-          <w:tab w:val="num" w:pos="5760"/>
-        </w:tabs>
-        <w:ind w:left="6240" w:hanging="480"/>
+        <w:ind w:left="6480" w:hanging="480"/>
       </w:pPr>
     </w:lvl>
   </w:abstractNum>
   <w:abstractNum w:abstractNumId="99413">
-    <w:nsid w:val="b3cbbdee"/>
+    <w:nsid w:val="A99413"/>
     <w:multiLevelType w:val="multilevel"/>
     <w:lvl w:ilvl="0">
       <w:start w:val="3"/>
@@ -2751,10 +2825,7 @@
       <w:lvlText w:val="%1."/>
       <w:lvlJc w:val="left"/>
       <w:pPr>
-        <w:tabs>
-          <w:tab w:val="num" w:pos="0"/>
-        </w:tabs>
-        <w:ind w:left="480" w:hanging="480"/>
+        <w:ind w:left="720" w:hanging="480"/>
       </w:pPr>
     </w:lvl>
     <w:lvl w:ilvl="1">
@@ -2763,10 +2834,7 @@
       <w:lvlText w:val="%2."/>
       <w:lvlJc w:val="left"/>
       <w:pPr>
-        <w:tabs>
-          <w:tab w:val="num" w:pos="720"/>
-        </w:tabs>
-        <w:ind w:left="1200" w:hanging="480"/>
+        <w:ind w:left="1440" w:hanging="480"/>
       </w:pPr>
     </w:lvl>
     <w:lvl w:ilvl="2">
@@ -2775,10 +2843,7 @@
       <w:lvlText w:val="%3."/>
       <w:lvlJc w:val="left"/>
       <w:pPr>
-        <w:tabs>
-          <w:tab w:val="num" w:pos="1440"/>
-        </w:tabs>
-        <w:ind w:left="1920" w:hanging="480"/>
+        <w:ind w:left="2160" w:hanging="480"/>
       </w:pPr>
     </w:lvl>
     <w:lvl w:ilvl="3">
@@ -2787,10 +2852,7 @@
       <w:lvlText w:val="%4."/>
       <w:lvlJc w:val="left"/>
       <w:pPr>
-        <w:tabs>
-          <w:tab w:val="num" w:pos="2160"/>
-        </w:tabs>
-        <w:ind w:left="2640" w:hanging="480"/>
+        <w:ind w:left="2880" w:hanging="480"/>
       </w:pPr>
     </w:lvl>
     <w:lvl w:ilvl="4">
@@ -2799,10 +2861,7 @@
       <w:lvlText w:val="%5."/>
       <w:lvlJc w:val="left"/>
       <w:pPr>
-        <w:tabs>
-          <w:tab w:val="num" w:pos="2880"/>
-        </w:tabs>
-        <w:ind w:left="3360" w:hanging="480"/>
+        <w:ind w:left="3600" w:hanging="480"/>
       </w:pPr>
     </w:lvl>
     <w:lvl w:ilvl="5">
@@ -2811,10 +2870,7 @@
       <w:lvlText w:val="%6."/>
       <w:lvlJc w:val="left"/>
       <w:pPr>
-        <w:tabs>
-          <w:tab w:val="num" w:pos="3600"/>
-        </w:tabs>
-        <w:ind w:left="4080" w:hanging="480"/>
+        <w:ind w:left="4320" w:hanging="480"/>
       </w:pPr>
     </w:lvl>
     <w:lvl w:ilvl="6">
@@ -2823,10 +2879,7 @@
       <w:lvlText w:val="%7."/>
       <w:lvlJc w:val="left"/>
       <w:pPr>
-        <w:tabs>
-          <w:tab w:val="num" w:pos="4320"/>
-        </w:tabs>
-        <w:ind w:left="4800" w:hanging="480"/>
+        <w:ind w:left="5040" w:hanging="480"/>
       </w:pPr>
     </w:lvl>
     <w:lvl w:ilvl="7">
@@ -2835,10 +2888,7 @@
       <w:lvlText w:val="%8."/>
       <w:lvlJc w:val="left"/>
       <w:pPr>
-        <w:tabs>
-          <w:tab w:val="num" w:pos="5040"/>
-        </w:tabs>
-        <w:ind w:left="5520" w:hanging="480"/>
+        <w:ind w:left="5760" w:hanging="480"/>
       </w:pPr>
     </w:lvl>
     <w:lvl w:ilvl="8">
@@ -2847,15 +2897,12 @@
       <w:lvlText w:val="%9."/>
       <w:lvlJc w:val="left"/>
       <w:pPr>
-        <w:tabs>
-          <w:tab w:val="num" w:pos="5760"/>
-        </w:tabs>
-        <w:ind w:left="6240" w:hanging="480"/>
+        <w:ind w:left="6480" w:hanging="480"/>
       </w:pPr>
     </w:lvl>
   </w:abstractNum>
   <w:abstractNum w:abstractNumId="99414">
-    <w:nsid w:val="4fbe019a"/>
+    <w:nsid w:val="A99414"/>
     <w:multiLevelType w:val="multilevel"/>
     <w:lvl w:ilvl="0">
       <w:start w:val="4"/>
@@ -2863,10 +2910,7 @@
       <w:lvlText w:val="%1."/>
       <w:lvlJc w:val="left"/>
       <w:pPr>
-        <w:tabs>
-          <w:tab w:val="num" w:pos="0"/>
-        </w:tabs>
-        <w:ind w:left="480" w:hanging="480"/>
+        <w:ind w:left="720" w:hanging="480"/>
       </w:pPr>
     </w:lvl>
     <w:lvl w:ilvl="1">
@@ -2875,10 +2919,7 @@
       <w:lvlText w:val="%2."/>
       <w:lvlJc w:val="left"/>
       <w:pPr>
-        <w:tabs>
-          <w:tab w:val="num" w:pos="720"/>
-        </w:tabs>
-        <w:ind w:left="1200" w:hanging="480"/>
+        <w:ind w:left="1440" w:hanging="480"/>
       </w:pPr>
     </w:lvl>
     <w:lvl w:ilvl="2">
@@ -2887,10 +2928,7 @@
       <w:lvlText w:val="%3."/>
       <w:lvlJc w:val="left"/>
       <w:pPr>
-        <w:tabs>
-          <w:tab w:val="num" w:pos="1440"/>
-        </w:tabs>
-        <w:ind w:left="1920" w:hanging="480"/>
+        <w:ind w:left="2160" w:hanging="480"/>
       </w:pPr>
     </w:lvl>
     <w:lvl w:ilvl="3">
@@ -2899,10 +2937,7 @@
       <w:lvlText w:val="%4."/>
       <w:lvlJc w:val="left"/>
       <w:pPr>
-        <w:tabs>
-          <w:tab w:val="num" w:pos="2160"/>
-        </w:tabs>
-        <w:ind w:left="2640" w:hanging="480"/>
+        <w:ind w:left="2880" w:hanging="480"/>
       </w:pPr>
     </w:lvl>
     <w:lvl w:ilvl="4">
@@ -2911,10 +2946,7 @@
       <w:lvlText w:val="%5."/>
       <w:lvlJc w:val="left"/>
       <w:pPr>
-        <w:tabs>
-          <w:tab w:val="num" w:pos="2880"/>
-        </w:tabs>
-        <w:ind w:left="3360" w:hanging="480"/>
+        <w:ind w:left="3600" w:hanging="480"/>
       </w:pPr>
     </w:lvl>
     <w:lvl w:ilvl="5">
@@ -2923,10 +2955,7 @@
       <w:lvlText w:val="%6."/>
       <w:lvlJc w:val="left"/>
       <w:pPr>
-        <w:tabs>
-          <w:tab w:val="num" w:pos="3600"/>
-        </w:tabs>
-        <w:ind w:left="4080" w:hanging="480"/>
+        <w:ind w:left="4320" w:hanging="480"/>
       </w:pPr>
     </w:lvl>
     <w:lvl w:ilvl="6">
@@ -2935,10 +2964,7 @@
       <w:lvlText w:val="%7."/>
       <w:lvlJc w:val="left"/>
       <w:pPr>
-        <w:tabs>
-          <w:tab w:val="num" w:pos="4320"/>
-        </w:tabs>
-        <w:ind w:left="4800" w:hanging="480"/>
+        <w:ind w:left="5040" w:hanging="480"/>
       </w:pPr>
     </w:lvl>
     <w:lvl w:ilvl="7">
@@ -2947,10 +2973,7 @@
       <w:lvlText w:val="%8."/>
       <w:lvlJc w:val="left"/>
       <w:pPr>
-        <w:tabs>
-          <w:tab w:val="num" w:pos="5040"/>
-        </w:tabs>
-        <w:ind w:left="5520" w:hanging="480"/>
+        <w:ind w:left="5760" w:hanging="480"/>
       </w:pPr>
     </w:lvl>
     <w:lvl w:ilvl="8">
@@ -2959,15 +2982,12 @@
       <w:lvlText w:val="%9."/>
       <w:lvlJc w:val="left"/>
       <w:pPr>
-        <w:tabs>
-          <w:tab w:val="num" w:pos="5760"/>
-        </w:tabs>
-        <w:ind w:left="6240" w:hanging="480"/>
+        <w:ind w:left="6480" w:hanging="480"/>
       </w:pPr>
     </w:lvl>
   </w:abstractNum>
   <w:abstractNum w:abstractNumId="99415">
-    <w:nsid w:val="91a27d85"/>
+    <w:nsid w:val="A99415"/>
     <w:multiLevelType w:val="multilevel"/>
     <w:lvl w:ilvl="0">
       <w:start w:val="5"/>
@@ -2975,10 +2995,7 @@
       <w:lvlText w:val="%1."/>
       <w:lvlJc w:val="left"/>
       <w:pPr>
-        <w:tabs>
-          <w:tab w:val="num" w:pos="0"/>
-        </w:tabs>
-        <w:ind w:left="480" w:hanging="480"/>
+        <w:ind w:left="720" w:hanging="480"/>
       </w:pPr>
     </w:lvl>
     <w:lvl w:ilvl="1">
@@ -2987,10 +3004,7 @@
       <w:lvlText w:val="%2."/>
       <w:lvlJc w:val="left"/>
       <w:pPr>
-        <w:tabs>
-          <w:tab w:val="num" w:pos="720"/>
-        </w:tabs>
-        <w:ind w:left="1200" w:hanging="480"/>
+        <w:ind w:left="1440" w:hanging="480"/>
       </w:pPr>
     </w:lvl>
     <w:lvl w:ilvl="2">
@@ -2999,10 +3013,7 @@
       <w:lvlText w:val="%3."/>
       <w:lvlJc w:val="left"/>
       <w:pPr>
-        <w:tabs>
-          <w:tab w:val="num" w:pos="1440"/>
-        </w:tabs>
-        <w:ind w:left="1920" w:hanging="480"/>
+        <w:ind w:left="2160" w:hanging="480"/>
       </w:pPr>
     </w:lvl>
     <w:lvl w:ilvl="3">
@@ -3011,10 +3022,7 @@
       <w:lvlText w:val="%4."/>
       <w:lvlJc w:val="left"/>
       <w:pPr>
-        <w:tabs>
-          <w:tab w:val="num" w:pos="2160"/>
-        </w:tabs>
-        <w:ind w:left="2640" w:hanging="480"/>
+        <w:ind w:left="2880" w:hanging="480"/>
       </w:pPr>
     </w:lvl>
     <w:lvl w:ilvl="4">
@@ -3023,10 +3031,7 @@
       <w:lvlText w:val="%5."/>
       <w:lvlJc w:val="left"/>
       <w:pPr>
-        <w:tabs>
-          <w:tab w:val="num" w:pos="2880"/>
-        </w:tabs>
-        <w:ind w:left="3360" w:hanging="480"/>
+        <w:ind w:left="3600" w:hanging="480"/>
       </w:pPr>
     </w:lvl>
     <w:lvl w:ilvl="5">
@@ -3035,10 +3040,7 @@
       <w:lvlText w:val="%6."/>
       <w:lvlJc w:val="left"/>
       <w:pPr>
-        <w:tabs>
-          <w:tab w:val="num" w:pos="3600"/>
-        </w:tabs>
-        <w:ind w:left="4080" w:hanging="480"/>
+        <w:ind w:left="4320" w:hanging="480"/>
       </w:pPr>
     </w:lvl>
     <w:lvl w:ilvl="6">
@@ -3047,10 +3049,7 @@
       <w:lvlText w:val="%7."/>
       <w:lvlJc w:val="left"/>
       <w:pPr>
-        <w:tabs>
-          <w:tab w:val="num" w:pos="4320"/>
-        </w:tabs>
-        <w:ind w:left="4800" w:hanging="480"/>
+        <w:ind w:left="5040" w:hanging="480"/>
       </w:pPr>
     </w:lvl>
     <w:lvl w:ilvl="7">
@@ -3059,10 +3058,7 @@
       <w:lvlText w:val="%8."/>
       <w:lvlJc w:val="left"/>
       <w:pPr>
-        <w:tabs>
-          <w:tab w:val="num" w:pos="5040"/>
-        </w:tabs>
-        <w:ind w:left="5520" w:hanging="480"/>
+        <w:ind w:left="5760" w:hanging="480"/>
       </w:pPr>
     </w:lvl>
     <w:lvl w:ilvl="8">
@@ -3071,15 +3067,12 @@
       <w:lvlText w:val="%9."/>
       <w:lvlJc w:val="left"/>
       <w:pPr>
-        <w:tabs>
-          <w:tab w:val="num" w:pos="5760"/>
-        </w:tabs>
-        <w:ind w:left="6240" w:hanging="480"/>
+        <w:ind w:left="6480" w:hanging="480"/>
       </w:pPr>
     </w:lvl>
   </w:abstractNum>
   <w:abstractNum w:abstractNumId="99416">
-    <w:nsid w:val="615f1ed2"/>
+    <w:nsid w:val="A99416"/>
     <w:multiLevelType w:val="multilevel"/>
     <w:lvl w:ilvl="0">
       <w:start w:val="6"/>
@@ -3087,10 +3080,7 @@
       <w:lvlText w:val="%1."/>
       <w:lvlJc w:val="left"/>
       <w:pPr>
-        <w:tabs>
-          <w:tab w:val="num" w:pos="0"/>
-        </w:tabs>
-        <w:ind w:left="480" w:hanging="480"/>
+        <w:ind w:left="720" w:hanging="480"/>
       </w:pPr>
     </w:lvl>
     <w:lvl w:ilvl="1">
@@ -3099,10 +3089,7 @@
       <w:lvlText w:val="%2."/>
       <w:lvlJc w:val="left"/>
       <w:pPr>
-        <w:tabs>
-          <w:tab w:val="num" w:pos="720"/>
-        </w:tabs>
-        <w:ind w:left="1200" w:hanging="480"/>
+        <w:ind w:left="1440" w:hanging="480"/>
       </w:pPr>
     </w:lvl>
     <w:lvl w:ilvl="2">
@@ -3111,10 +3098,7 @@
       <w:lvlText w:val="%3."/>
       <w:lvlJc w:val="left"/>
       <w:pPr>
-        <w:tabs>
-          <w:tab w:val="num" w:pos="1440"/>
-        </w:tabs>
-        <w:ind w:left="1920" w:hanging="480"/>
+        <w:ind w:left="2160" w:hanging="480"/>
       </w:pPr>
     </w:lvl>
     <w:lvl w:ilvl="3">
@@ -3123,10 +3107,7 @@
       <w:lvlText w:val="%4."/>
       <w:lvlJc w:val="left"/>
       <w:pPr>
-        <w:tabs>
-          <w:tab w:val="num" w:pos="2160"/>
-        </w:tabs>
-        <w:ind w:left="2640" w:hanging="480"/>
+        <w:ind w:left="2880" w:hanging="480"/>
       </w:pPr>
     </w:lvl>
     <w:lvl w:ilvl="4">
@@ -3135,10 +3116,7 @@
       <w:lvlText w:val="%5."/>
       <w:lvlJc w:val="left"/>
       <w:pPr>
-        <w:tabs>
-          <w:tab w:val="num" w:pos="2880"/>
-        </w:tabs>
-        <w:ind w:left="3360" w:hanging="480"/>
+        <w:ind w:left="3600" w:hanging="480"/>
       </w:pPr>
     </w:lvl>
     <w:lvl w:ilvl="5">
@@ -3147,10 +3125,7 @@
       <w:lvlText w:val="%6."/>
       <w:lvlJc w:val="left"/>
       <w:pPr>
-        <w:tabs>
-          <w:tab w:val="num" w:pos="3600"/>
-        </w:tabs>
-        <w:ind w:left="4080" w:hanging="480"/>
+        <w:ind w:left="4320" w:hanging="480"/>
       </w:pPr>
     </w:lvl>
     <w:lvl w:ilvl="6">
@@ -3159,10 +3134,7 @@
       <w:lvlText w:val="%7."/>
       <w:lvlJc w:val="left"/>
       <w:pPr>
-        <w:tabs>
-          <w:tab w:val="num" w:pos="4320"/>
-        </w:tabs>
-        <w:ind w:left="4800" w:hanging="480"/>
+        <w:ind w:left="5040" w:hanging="480"/>
       </w:pPr>
     </w:lvl>
     <w:lvl w:ilvl="7">
@@ -3171,10 +3143,7 @@
       <w:lvlText w:val="%8."/>
       <w:lvlJc w:val="left"/>
       <w:pPr>
-        <w:tabs>
-          <w:tab w:val="num" w:pos="5040"/>
-        </w:tabs>
-        <w:ind w:left="5520" w:hanging="480"/>
+        <w:ind w:left="5760" w:hanging="480"/>
       </w:pPr>
     </w:lvl>
     <w:lvl w:ilvl="8">
@@ -3183,15 +3152,12 @@
       <w:lvlText w:val="%9."/>
       <w:lvlJc w:val="left"/>
       <w:pPr>
-        <w:tabs>
-          <w:tab w:val="num" w:pos="5760"/>
-        </w:tabs>
-        <w:ind w:left="6240" w:hanging="480"/>
+        <w:ind w:left="6480" w:hanging="480"/>
       </w:pPr>
     </w:lvl>
   </w:abstractNum>
   <w:abstractNum w:abstractNumId="99417">
-    <w:nsid w:val="238d8174"/>
+    <w:nsid w:val="A99417"/>
     <w:multiLevelType w:val="multilevel"/>
     <w:lvl w:ilvl="0">
       <w:start w:val="7"/>
@@ -3199,10 +3165,7 @@
       <w:lvlText w:val="%1."/>
       <w:lvlJc w:val="left"/>
       <w:pPr>
-        <w:tabs>
-          <w:tab w:val="num" w:pos="0"/>
-        </w:tabs>
-        <w:ind w:left="480" w:hanging="480"/>
+        <w:ind w:left="720" w:hanging="480"/>
       </w:pPr>
     </w:lvl>
     <w:lvl w:ilvl="1">
@@ -3211,10 +3174,7 @@
       <w:lvlText w:val="%2."/>
       <w:lvlJc w:val="left"/>
       <w:pPr>
-        <w:tabs>
-          <w:tab w:val="num" w:pos="720"/>
-        </w:tabs>
-        <w:ind w:left="1200" w:hanging="480"/>
+        <w:ind w:left="1440" w:hanging="480"/>
       </w:pPr>
     </w:lvl>
     <w:lvl w:ilvl="2">
@@ -3223,10 +3183,7 @@
       <w:lvlText w:val="%3."/>
       <w:lvlJc w:val="left"/>
       <w:pPr>
-        <w:tabs>
-          <w:tab w:val="num" w:pos="1440"/>
-        </w:tabs>
-        <w:ind w:left="1920" w:hanging="480"/>
+        <w:ind w:left="2160" w:hanging="480"/>
       </w:pPr>
     </w:lvl>
     <w:lvl w:ilvl="3">
@@ -3235,10 +3192,7 @@
       <w:lvlText w:val="%4."/>
       <w:lvlJc w:val="left"/>
       <w:pPr>
-        <w:tabs>
-          <w:tab w:val="num" w:pos="2160"/>
-        </w:tabs>
-        <w:ind w:left="2640" w:hanging="480"/>
+        <w:ind w:left="2880" w:hanging="480"/>
       </w:pPr>
     </w:lvl>
     <w:lvl w:ilvl="4">
@@ -3247,10 +3201,7 @@
       <w:lvlText w:val="%5."/>
       <w:lvlJc w:val="left"/>
       <w:pPr>
-        <w:tabs>
-          <w:tab w:val="num" w:pos="2880"/>
-        </w:tabs>
-        <w:ind w:left="3360" w:hanging="480"/>
+        <w:ind w:left="3600" w:hanging="480"/>
       </w:pPr>
     </w:lvl>
     <w:lvl w:ilvl="5">
@@ -3259,10 +3210,7 @@
       <w:lvlText w:val="%6."/>
       <w:lvlJc w:val="left"/>
       <w:pPr>
-        <w:tabs>
-          <w:tab w:val="num" w:pos="3600"/>
-        </w:tabs>
-        <w:ind w:left="4080" w:hanging="480"/>
+        <w:ind w:left="4320" w:hanging="480"/>
       </w:pPr>
     </w:lvl>
     <w:lvl w:ilvl="6">
@@ -3271,10 +3219,7 @@
       <w:lvlText w:val="%7."/>
       <w:lvlJc w:val="left"/>
       <w:pPr>
-        <w:tabs>
-          <w:tab w:val="num" w:pos="4320"/>
-        </w:tabs>
-        <w:ind w:left="4800" w:hanging="480"/>
+        <w:ind w:left="5040" w:hanging="480"/>
       </w:pPr>
     </w:lvl>
     <w:lvl w:ilvl="7">
@@ -3283,10 +3228,7 @@
       <w:lvlText w:val="%8."/>
       <w:lvlJc w:val="left"/>
       <w:pPr>
-        <w:tabs>
-          <w:tab w:val="num" w:pos="5040"/>
-        </w:tabs>
-        <w:ind w:left="5520" w:hanging="480"/>
+        <w:ind w:left="5760" w:hanging="480"/>
       </w:pPr>
     </w:lvl>
     <w:lvl w:ilvl="8">
@@ -3295,15 +3237,12 @@
       <w:lvlText w:val="%9."/>
       <w:lvlJc w:val="left"/>
       <w:pPr>
-        <w:tabs>
-          <w:tab w:val="num" w:pos="5760"/>
-        </w:tabs>
-        <w:ind w:left="6240" w:hanging="480"/>
+        <w:ind w:left="6480" w:hanging="480"/>
       </w:pPr>
     </w:lvl>
   </w:abstractNum>
   <w:abstractNum w:abstractNumId="99418">
-    <w:nsid w:val="41f388d6"/>
+    <w:nsid w:val="A99418"/>
     <w:multiLevelType w:val="multilevel"/>
     <w:lvl w:ilvl="0">
       <w:start w:val="8"/>
@@ -3311,10 +3250,7 @@
       <w:lvlText w:val="%1."/>
       <w:lvlJc w:val="left"/>
       <w:pPr>
-        <w:tabs>
-          <w:tab w:val="num" w:pos="0"/>
-        </w:tabs>
-        <w:ind w:left="480" w:hanging="480"/>
+        <w:ind w:left="720" w:hanging="480"/>
       </w:pPr>
     </w:lvl>
     <w:lvl w:ilvl="1">
@@ -3323,10 +3259,7 @@
       <w:lvlText w:val="%2."/>
       <w:lvlJc w:val="left"/>
       <w:pPr>
-        <w:tabs>
-          <w:tab w:val="num" w:pos="720"/>
-        </w:tabs>
-        <w:ind w:left="1200" w:hanging="480"/>
+        <w:ind w:left="1440" w:hanging="480"/>
       </w:pPr>
     </w:lvl>
     <w:lvl w:ilvl="2">
@@ -3335,10 +3268,7 @@
       <w:lvlText w:val="%3."/>
       <w:lvlJc w:val="left"/>
       <w:pPr>
-        <w:tabs>
-          <w:tab w:val="num" w:pos="1440"/>
-        </w:tabs>
-        <w:ind w:left="1920" w:hanging="480"/>
+        <w:ind w:left="2160" w:hanging="480"/>
       </w:pPr>
     </w:lvl>
     <w:lvl w:ilvl="3">
@@ -3347,10 +3277,7 @@
       <w:lvlText w:val="%4."/>
       <w:lvlJc w:val="left"/>
       <w:pPr>
-        <w:tabs>
-          <w:tab w:val="num" w:pos="2160"/>
-        </w:tabs>
-        <w:ind w:left="2640" w:hanging="480"/>
+        <w:ind w:left="2880" w:hanging="480"/>
       </w:pPr>
     </w:lvl>
     <w:lvl w:ilvl="4">
@@ -3359,10 +3286,7 @@
       <w:lvlText w:val="%5."/>
       <w:lvlJc w:val="left"/>
       <w:pPr>
-        <w:tabs>
-          <w:tab w:val="num" w:pos="2880"/>
-        </w:tabs>
-        <w:ind w:left="3360" w:hanging="480"/>
+        <w:ind w:left="3600" w:hanging="480"/>
       </w:pPr>
     </w:lvl>
     <w:lvl w:ilvl="5">
@@ -3371,10 +3295,7 @@
       <w:lvlText w:val="%6."/>
       <w:lvlJc w:val="left"/>
       <w:pPr>
-        <w:tabs>
-          <w:tab w:val="num" w:pos="3600"/>
-        </w:tabs>
-        <w:ind w:left="4080" w:hanging="480"/>
+        <w:ind w:left="4320" w:hanging="480"/>
       </w:pPr>
     </w:lvl>
     <w:lvl w:ilvl="6">
@@ -3383,10 +3304,7 @@
       <w:lvlText w:val="%7."/>
       <w:lvlJc w:val="left"/>
       <w:pPr>
-        <w:tabs>
-          <w:tab w:val="num" w:pos="4320"/>
-        </w:tabs>
-        <w:ind w:left="4800" w:hanging="480"/>
+        <w:ind w:left="5040" w:hanging="480"/>
       </w:pPr>
     </w:lvl>
     <w:lvl w:ilvl="7">
@@ -3395,10 +3313,7 @@
       <w:lvlText w:val="%8."/>
       <w:lvlJc w:val="left"/>
       <w:pPr>
-        <w:tabs>
-          <w:tab w:val="num" w:pos="5040"/>
-        </w:tabs>
-        <w:ind w:left="5520" w:hanging="480"/>
+        <w:ind w:left="5760" w:hanging="480"/>
       </w:pPr>
     </w:lvl>
     <w:lvl w:ilvl="8">
@@ -3407,15 +3322,12 @@
       <w:lvlText w:val="%9."/>
       <w:lvlJc w:val="left"/>
       <w:pPr>
-        <w:tabs>
-          <w:tab w:val="num" w:pos="5760"/>
-        </w:tabs>
-        <w:ind w:left="6240" w:hanging="480"/>
+        <w:ind w:left="6480" w:hanging="480"/>
       </w:pPr>
     </w:lvl>
   </w:abstractNum>
   <w:abstractNum w:abstractNumId="99419">
-    <w:nsid w:val="da4300bd"/>
+    <w:nsid w:val="A99419"/>
     <w:multiLevelType w:val="multilevel"/>
     <w:lvl w:ilvl="0">
       <w:start w:val="9"/>
@@ -3423,10 +3335,7 @@
       <w:lvlText w:val="%1."/>
       <w:lvlJc w:val="left"/>
       <w:pPr>
-        <w:tabs>
-          <w:tab w:val="num" w:pos="0"/>
-        </w:tabs>
-        <w:ind w:left="480" w:hanging="480"/>
+        <w:ind w:left="720" w:hanging="480"/>
       </w:pPr>
     </w:lvl>
     <w:lvl w:ilvl="1">
@@ -3435,10 +3344,7 @@
       <w:lvlText w:val="%2."/>
       <w:lvlJc w:val="left"/>
       <w:pPr>
-        <w:tabs>
-          <w:tab w:val="num" w:pos="720"/>
-        </w:tabs>
-        <w:ind w:left="1200" w:hanging="480"/>
+        <w:ind w:left="1440" w:hanging="480"/>
       </w:pPr>
     </w:lvl>
     <w:lvl w:ilvl="2">
@@ -3447,10 +3353,7 @@
       <w:lvlText w:val="%3."/>
       <w:lvlJc w:val="left"/>
       <w:pPr>
-        <w:tabs>
-          <w:tab w:val="num" w:pos="1440"/>
-        </w:tabs>
-        <w:ind w:left="1920" w:hanging="480"/>
+        <w:ind w:left="2160" w:hanging="480"/>
       </w:pPr>
     </w:lvl>
     <w:lvl w:ilvl="3">
@@ -3459,10 +3362,7 @@
       <w:lvlText w:val="%4."/>
       <w:lvlJc w:val="left"/>
       <w:pPr>
-        <w:tabs>
-          <w:tab w:val="num" w:pos="2160"/>
-        </w:tabs>
-        <w:ind w:left="2640" w:hanging="480"/>
+        <w:ind w:left="2880" w:hanging="480"/>
       </w:pPr>
     </w:lvl>
     <w:lvl w:ilvl="4">
@@ -3471,10 +3371,7 @@
       <w:lvlText w:val="%5."/>
       <w:lvlJc w:val="left"/>
       <w:pPr>
-        <w:tabs>
-          <w:tab w:val="num" w:pos="2880"/>
-        </w:tabs>
-        <w:ind w:left="3360" w:hanging="480"/>
+        <w:ind w:left="3600" w:hanging="480"/>
       </w:pPr>
     </w:lvl>
     <w:lvl w:ilvl="5">
@@ -3483,10 +3380,7 @@
       <w:lvlText w:val="%6."/>
       <w:lvlJc w:val="left"/>
       <w:pPr>
-        <w:tabs>
-          <w:tab w:val="num" w:pos="3600"/>
-        </w:tabs>
-        <w:ind w:left="4080" w:hanging="480"/>
+        <w:ind w:left="4320" w:hanging="480"/>
       </w:pPr>
     </w:lvl>
     <w:lvl w:ilvl="6">
@@ -3495,10 +3389,7 @@
       <w:lvlText w:val="%7."/>
       <w:lvlJc w:val="left"/>
       <w:pPr>
-        <w:tabs>
-          <w:tab w:val="num" w:pos="4320"/>
-        </w:tabs>
-        <w:ind w:left="4800" w:hanging="480"/>
+        <w:ind w:left="5040" w:hanging="480"/>
       </w:pPr>
     </w:lvl>
     <w:lvl w:ilvl="7">
@@ -3507,10 +3398,7 @@
       <w:lvlText w:val="%8."/>
       <w:lvlJc w:val="left"/>
       <w:pPr>
-        <w:tabs>
-          <w:tab w:val="num" w:pos="5040"/>
-        </w:tabs>
-        <w:ind w:left="5520" w:hanging="480"/>
+        <w:ind w:left="5760" w:hanging="480"/>
       </w:pPr>
     </w:lvl>
     <w:lvl w:ilvl="8">
@@ -3519,10 +3407,7 @@
       <w:lvlText w:val="%9."/>
       <w:lvlJc w:val="left"/>
       <w:pPr>
-        <w:tabs>
-          <w:tab w:val="num" w:pos="5760"/>
-        </w:tabs>
-        <w:ind w:left="6240" w:hanging="480"/>
+        <w:ind w:left="6480" w:hanging="480"/>
       </w:pPr>
     </w:lvl>
   </w:abstractNum>
@@ -5250,10 +5135,10 @@
   <w:docDefaults>
     <w:rPrDefault>
       <w:rPr>
-        <w:rFonts w:asciiTheme="minorHAnsi" w:eastAsiaTheme="minorHAnsi" w:hAnsiTheme="minorHAnsi" w:cstheme="minorBidi"/>
+        <w:rFonts w:asciiTheme="minorHAnsi" w:cstheme="minorBidi" w:eastAsiaTheme="minorHAnsi" w:hAnsiTheme="minorHAnsi"/>
         <w:sz w:val="24"/>
         <w:szCs w:val="24"/>
-        <w:lang w:val="en-US" w:eastAsia="en-US" w:bidi="ar-SA"/>
+        <w:lang w:bidi="ar-SA" w:eastAsia="en-US" w:val="en-US"/>
       </w:rPr>
     </w:rPrDefault>
     <w:pPrDefault>
@@ -5262,35 +5147,35 @@
       </w:pPr>
     </w:pPrDefault>
   </w:docDefaults>
-  <w:latentStyles w:defLockedState="0" w:defUIPriority="0" w:defSemiHidden="0" w:defUnhideWhenUsed="0" w:defQFormat="0" w:count="276"/>
-  <w:style w:type="paragraph" w:default="1" w:styleId="Normal">
+  <w:latentStyles w:count="276" w:defLockedState="0" w:defQFormat="0" w:defSemiHidden="0" w:defUIPriority="0" w:defUnhideWhenUsed="0"/>
+  <w:style w:default="1" w:styleId="Normal" w:type="paragraph">
     <w:name w:val="Normal"/>
     <w:qFormat/>
   </w:style>
-  <w:style w:type="paragraph" w:styleId="BodyText">
+  <w:style w:styleId="BodyText" w:type="paragraph">
     <w:name w:val="Body Text"/>
     <w:basedOn w:val="Normal"/>
     <w:link w:val="BodyTextChar"/>
     <w:pPr>
-      <w:spacing w:before="180" w:after="180"/>
+      <w:spacing w:after="180" w:before="180"/>
     </w:pPr>
     <w:qFormat/>
   </w:style>
-  <w:style w:type="paragraph" w:customStyle="1" w:styleId="FirstParagraph">
+  <w:style w:customStyle="1" w:styleId="FirstParagraph" w:type="paragraph">
     <w:name w:val="First Paragraph"/>
     <w:basedOn w:val="BodyText"/>
     <w:next w:val="BodyText"/>
     <w:qFormat/>
   </w:style>
-  <w:style w:type="paragraph" w:customStyle="1" w:styleId="Compact">
+  <w:style w:customStyle="1" w:styleId="Compact" w:type="paragraph">
     <w:name w:val="Compact"/>
     <w:basedOn w:val="BodyText"/>
     <w:qFormat/>
     <w:pPr>
-      <w:spacing w:before="36" w:after="36"/>
+      <w:spacing w:after="36" w:before="36"/>
     </w:pPr>
   </w:style>
-  <w:style w:type="paragraph" w:styleId="Title">
+  <w:style w:styleId="Title" w:type="paragraph">
     <w:name w:val="Title"/>
     <w:basedOn w:val="Normal"/>
     <w:next w:val="BodyText"/>
@@ -5298,19 +5183,19 @@
     <w:pPr>
       <w:keepNext/>
       <w:keepLines/>
-      <w:spacing w:before="480" w:after="240"/>
+      <w:spacing w:after="240" w:before="480"/>
       <w:jc w:val="center"/>
     </w:pPr>
     <w:rPr>
-      <w:rFonts w:asciiTheme="majorHAnsi" w:eastAsiaTheme="majorEastAsia" w:hAnsiTheme="majorHAnsi" w:cstheme="majorBidi"/>
+      <w:rFonts w:asciiTheme="majorHAnsi" w:cstheme="majorBidi" w:eastAsiaTheme="majorEastAsia" w:hAnsiTheme="majorHAnsi"/>
       <w:b/>
       <w:bCs/>
-      <w:color w:val="345A8A" w:themeColor="accent1" w:themeShade="B5"/>
+      <w:color w:themeColor="accent1" w:themeShade="B5" w:val="345A8A"/>
       <w:sz w:val="36"/>
       <w:szCs w:val="36"/>
     </w:rPr>
   </w:style>
-  <w:style w:type="paragraph" w:styleId="Subtitle">
+  <w:style w:styleId="Subtitle" w:type="paragraph">
     <w:name w:val="Subtitle"/>
     <w:basedOn w:val="Title"/>
     <w:next w:val="BodyText"/>
@@ -5318,7 +5203,7 @@
     <w:pPr>
       <w:keepNext/>
       <w:keepLines/>
-      <w:spacing w:before="240" w:after="240"/>
+      <w:spacing w:after="240" w:before="240"/>
       <w:jc w:val="center"/>
     </w:pPr>
     <w:rPr>
@@ -5326,7 +5211,7 @@
       <w:szCs w:val="30"/>
     </w:rPr>
   </w:style>
-  <w:style w:type="paragraph" w:customStyle="1" w:styleId="Author">
+  <w:style w:customStyle="1" w:styleId="Author" w:type="paragraph">
     <w:name w:val="Author"/>
     <w:next w:val="BodyText"/>
     <w:qFormat/>
@@ -5336,7 +5221,7 @@
       <w:jc w:val="center"/>
     </w:pPr>
   </w:style>
-  <w:style w:type="paragraph" w:styleId="Date">
+  <w:style w:styleId="Date" w:type="paragraph">
     <w:name w:val="Date"/>
     <w:next w:val="BodyText"/>
     <w:qFormat/>
@@ -5346,7 +5231,26 @@
       <w:jc w:val="center"/>
     </w:pPr>
   </w:style>
-  <w:style w:type="paragraph" w:customStyle="1" w:styleId="Abstract">
+  <w:style w:customStyle="1" w:styleId="AbstractTitle" w:type="paragraph">
+    <w:name w:val="Abstract Title"/>
+    <w:basedOn w:val="Normal"/>
+    <w:next w:val="Abstract"/>
+    <w:qFormat/>
+    <w:pPr>
+      <w:keepNext/>
+      <w:keepLines/>
+      <w:jc w:val="center"/>
+      <w:spacing w:after="0" w:before="300"/>
+    </w:pPr>
+    <w:rPr>
+      <w:sz w:val="20"/>
+      <w:szCs w:val="20"/>
+      <w:b/>
+      <w:color w:val="345A8A"/>
+      &gt;
+    </w:rPr>
+  </w:style>
+  <w:style w:customStyle="1" w:styleId="Abstract" w:type="paragraph">
     <w:name w:val="Abstract"/>
     <w:basedOn w:val="Normal"/>
     <w:next w:val="BodyText"/>
@@ -5354,14 +5258,14 @@
     <w:pPr>
       <w:keepNext/>
       <w:keepLines/>
-      <w:spacing w:before="300" w:after="300"/>
+      <w:spacing w:after="300" w:before="100"/>
     </w:pPr>
     <w:rPr>
       <w:sz w:val="20"/>
       <w:szCs w:val="20"/>
     </w:rPr>
   </w:style>
-  <w:style w:type="paragraph" w:styleId="Bibliography">
+  <w:style w:styleId="Bibliography" w:type="paragraph">
     <w:name w:val="Bibliography"/>
     <w:basedOn w:val="Normal"/>
     <w:next w:val="Bibliography"/>
@@ -5369,7 +5273,7 @@
     <w:pPr/>
     <w:rPr/>
   </w:style>
-  <w:style w:type="paragraph" w:styleId="Heading1">
+  <w:style w:styleId="Heading1" w:type="paragraph">
     <w:name w:val="Heading 1"/>
     <w:basedOn w:val="Normal"/>
     <w:next w:val="BodyText"/>
@@ -5378,19 +5282,19 @@
     <w:pPr>
       <w:keepNext/>
       <w:keepLines/>
-      <w:spacing w:before="480" w:after="0"/>
+      <w:spacing w:after="0" w:before="480"/>
       <w:outlineLvl w:val="0"/>
     </w:pPr>
     <w:rPr>
-      <w:rFonts w:asciiTheme="majorHAnsi" w:eastAsiaTheme="majorEastAsia" w:hAnsiTheme="majorHAnsi" w:cstheme="majorBidi"/>
+      <w:rFonts w:asciiTheme="majorHAnsi" w:cstheme="majorBidi" w:eastAsiaTheme="majorEastAsia" w:hAnsiTheme="majorHAnsi"/>
       <w:b/>
       <w:bCs/>
-      <w:color w:val="4F81BD" w:themeColor="accent1"/>
+      <w:color w:themeColor="accent1" w:val="4F81BD"/>
       <w:sz w:val="32"/>
       <w:szCs w:val="32"/>
     </w:rPr>
   </w:style>
-  <w:style w:type="paragraph" w:styleId="Heading2">
+  <w:style w:styleId="Heading2" w:type="paragraph">
     <w:name w:val="Heading 2"/>
     <w:basedOn w:val="Normal"/>
     <w:next w:val="BodyText"/>
@@ -5400,19 +5304,19 @@
     <w:pPr>
       <w:keepNext/>
       <w:keepLines/>
-      <w:spacing w:before="200" w:after="0"/>
+      <w:spacing w:after="0" w:before="200"/>
       <w:outlineLvl w:val="1"/>
     </w:pPr>
     <w:rPr>
-      <w:rFonts w:asciiTheme="majorHAnsi" w:eastAsiaTheme="majorEastAsia" w:hAnsiTheme="majorHAnsi" w:cstheme="majorBidi"/>
+      <w:rFonts w:asciiTheme="majorHAnsi" w:cstheme="majorBidi" w:eastAsiaTheme="majorEastAsia" w:hAnsiTheme="majorHAnsi"/>
       <w:b/>
       <w:bCs/>
-      <w:color w:val="4F81BD" w:themeColor="accent1"/>
+      <w:color w:themeColor="accent1" w:val="4F81BD"/>
       <w:sz w:val="28"/>
       <w:szCs w:val="28"/>
     </w:rPr>
   </w:style>
-  <w:style w:type="paragraph" w:styleId="Heading3">
+  <w:style w:styleId="Heading3" w:type="paragraph">
     <w:name w:val="Heading 3"/>
     <w:basedOn w:val="Normal"/>
     <w:next w:val="BodyText"/>
@@ -5422,19 +5326,19 @@
     <w:pPr>
       <w:keepNext/>
       <w:keepLines/>
-      <w:spacing w:before="200" w:after="0"/>
+      <w:spacing w:after="0" w:before="200"/>
       <w:outlineLvl w:val="2"/>
     </w:pPr>
     <w:rPr>
-      <w:rFonts w:asciiTheme="majorHAnsi" w:eastAsiaTheme="majorEastAsia" w:hAnsiTheme="majorHAnsi" w:cstheme="majorBidi"/>
+      <w:rFonts w:asciiTheme="majorHAnsi" w:cstheme="majorBidi" w:eastAsiaTheme="majorEastAsia" w:hAnsiTheme="majorHAnsi"/>
       <w:b/>
       <w:bCs/>
-      <w:color w:val="4F81BD" w:themeColor="accent1"/>
+      <w:color w:themeColor="accent1" w:val="4F81BD"/>
       <w:sz w:val="24"/>
       <w:szCs w:val="24"/>
     </w:rPr>
   </w:style>
-  <w:style w:type="paragraph" w:styleId="Heading4">
+  <w:style w:styleId="Heading4" w:type="paragraph">
     <w:name w:val="Heading 4"/>
     <w:basedOn w:val="Normal"/>
     <w:next w:val="BodyText"/>
@@ -5444,19 +5348,19 @@
     <w:pPr>
       <w:keepNext/>
       <w:keepLines/>
-      <w:spacing w:before="200" w:after="0"/>
+      <w:spacing w:after="0" w:before="200"/>
       <w:outlineLvl w:val="3"/>
     </w:pPr>
     <w:rPr>
-      <w:rFonts w:asciiTheme="majorHAnsi" w:eastAsiaTheme="majorEastAsia" w:hAnsiTheme="majorHAnsi" w:cstheme="majorBidi"/>
+      <w:rFonts w:asciiTheme="majorHAnsi" w:cstheme="majorBidi" w:eastAsiaTheme="majorEastAsia" w:hAnsiTheme="majorHAnsi"/>
       <w:i/>
       <w:bCs/>
-      <w:color w:val="4F81BD" w:themeColor="accent1"/>
+      <w:color w:themeColor="accent1" w:val="4F81BD"/>
       <w:sz w:val="24"/>
       <w:szCs w:val="24"/>
     </w:rPr>
   </w:style>
-  <w:style w:type="paragraph" w:styleId="Heading5">
+  <w:style w:styleId="Heading5" w:type="paragraph">
     <w:name w:val="Heading 5"/>
     <w:basedOn w:val="Normal"/>
     <w:next w:val="BodyText"/>
@@ -5466,18 +5370,18 @@
     <w:pPr>
       <w:keepNext/>
       <w:keepLines/>
-      <w:spacing w:before="200" w:after="0"/>
+      <w:spacing w:after="0" w:before="200"/>
       <w:outlineLvl w:val="4"/>
     </w:pPr>
     <w:rPr>
-      <w:rFonts w:asciiTheme="majorHAnsi" w:eastAsiaTheme="majorEastAsia" w:hAnsiTheme="majorHAnsi" w:cstheme="majorBidi"/>
+      <w:rFonts w:asciiTheme="majorHAnsi" w:cstheme="majorBidi" w:eastAsiaTheme="majorEastAsia" w:hAnsiTheme="majorHAnsi"/>
       <w:iCs/>
-      <w:color w:val="4F81BD" w:themeColor="accent1"/>
+      <w:color w:themeColor="accent1" w:val="4F81BD"/>
       <w:sz w:val="24"/>
       <w:szCs w:val="24"/>
     </w:rPr>
   </w:style>
-  <w:style w:type="paragraph" w:styleId="Heading6">
+  <w:style w:styleId="Heading6" w:type="paragraph">
     <w:name w:val="Heading 6"/>
     <w:basedOn w:val="Normal"/>
     <w:next w:val="BodyText"/>
@@ -5487,17 +5391,17 @@
     <w:pPr>
       <w:keepNext/>
       <w:keepLines/>
-      <w:spacing w:before="200" w:after="0"/>
+      <w:spacing w:after="0" w:before="200"/>
       <w:outlineLvl w:val="5"/>
     </w:pPr>
     <w:rPr>
-      <w:rFonts w:asciiTheme="majorHAnsi" w:eastAsiaTheme="majorEastAsia" w:hAnsiTheme="majorHAnsi" w:cstheme="majorBidi"/>
-      <w:color w:val="4F81BD" w:themeColor="accent1"/>
+      <w:rFonts w:asciiTheme="majorHAnsi" w:cstheme="majorBidi" w:eastAsiaTheme="majorEastAsia" w:hAnsiTheme="majorHAnsi"/>
+      <w:color w:themeColor="accent1" w:val="4F81BD"/>
       <w:sz w:val="24"/>
       <w:szCs w:val="24"/>
     </w:rPr>
   </w:style>
-  <w:style w:type="paragraph" w:styleId="Heading7">
+  <w:style w:styleId="Heading7" w:type="paragraph">
     <w:name w:val="Heading 7"/>
     <w:basedOn w:val="Normal"/>
     <w:next w:val="BodyText"/>
@@ -5507,17 +5411,17 @@
     <w:pPr>
       <w:keepNext/>
       <w:keepLines/>
-      <w:spacing w:before="200" w:after="0"/>
+      <w:spacing w:after="0" w:before="200"/>
       <w:outlineLvl w:val="6"/>
     </w:pPr>
     <w:rPr>
-      <w:rFonts w:asciiTheme="majorHAnsi" w:eastAsiaTheme="majorEastAsia" w:hAnsiTheme="majorHAnsi" w:cstheme="majorBidi"/>
-      <w:color w:val="4F81BD" w:themeColor="accent1"/>
+      <w:rFonts w:asciiTheme="majorHAnsi" w:cstheme="majorBidi" w:eastAsiaTheme="majorEastAsia" w:hAnsiTheme="majorHAnsi"/>
+      <w:color w:themeColor="accent1" w:val="4F81BD"/>
       <w:sz w:val="24"/>
       <w:szCs w:val="24"/>
     </w:rPr>
   </w:style>
-  <w:style w:type="paragraph" w:styleId="Heading8">
+  <w:style w:styleId="Heading8" w:type="paragraph">
     <w:name w:val="Heading 8"/>
     <w:basedOn w:val="Normal"/>
     <w:next w:val="BodyText"/>
@@ -5527,17 +5431,17 @@
     <w:pPr>
       <w:keepNext/>
       <w:keepLines/>
-      <w:spacing w:before="200" w:after="0"/>
+      <w:spacing w:after="0" w:before="200"/>
       <w:outlineLvl w:val="7"/>
     </w:pPr>
     <w:rPr>
-      <w:rFonts w:asciiTheme="majorHAnsi" w:eastAsiaTheme="majorEastAsia" w:hAnsiTheme="majorHAnsi" w:cstheme="majorBidi"/>
-      <w:color w:val="4F81BD" w:themeColor="accent1"/>
+      <w:rFonts w:asciiTheme="majorHAnsi" w:cstheme="majorBidi" w:eastAsiaTheme="majorEastAsia" w:hAnsiTheme="majorHAnsi"/>
+      <w:color w:themeColor="accent1" w:val="4F81BD"/>
       <w:sz w:val="24"/>
       <w:szCs w:val="24"/>
     </w:rPr>
   </w:style>
-  <w:style w:type="paragraph" w:styleId="Heading9">
+  <w:style w:styleId="Heading9" w:type="paragraph">
     <w:name w:val="Heading 9"/>
     <w:basedOn w:val="Normal"/>
     <w:next w:val="BodyText"/>
@@ -5547,17 +5451,17 @@
     <w:pPr>
       <w:keepNext/>
       <w:keepLines/>
-      <w:spacing w:before="200" w:after="0"/>
+      <w:spacing w:after="0" w:before="200"/>
       <w:outlineLvl w:val="8"/>
     </w:pPr>
     <w:rPr>
-      <w:rFonts w:asciiTheme="majorHAnsi" w:eastAsiaTheme="majorEastAsia" w:hAnsiTheme="majorHAnsi" w:cstheme="majorBidi"/>
-      <w:color w:val="4F81BD" w:themeColor="accent1"/>
+      <w:rFonts w:asciiTheme="majorHAnsi" w:cstheme="majorBidi" w:eastAsiaTheme="majorEastAsia" w:hAnsiTheme="majorHAnsi"/>
+      <w:color w:themeColor="accent1" w:val="4F81BD"/>
       <w:sz w:val="24"/>
       <w:szCs w:val="24"/>
     </w:rPr>
   </w:style>
-  <w:style w:type="paragraph" w:styleId="BlockText">
+  <w:style w:styleId="BlockText" w:type="paragraph">
     <w:name w:val="Block Text"/>
     <w:basedOn w:val="BodyText"/>
     <w:next w:val="BodyText"/>
@@ -5565,11 +5469,11 @@
     <w:unhideWhenUsed/>
     <w:qFormat/>
     <w:pPr>
-      <w:spacing w:before="100" w:after="100"/>
+      <w:spacing w:after="100" w:before="100"/>
       <w:ind w:firstLine="0" w:left="480" w:right="480"/>
     </w:pPr>
   </w:style>
-  <w:style w:type="paragraph" w:styleId="FootnoteText">
+  <w:style w:styleId="FootnoteText" w:type="paragraph">
     <w:name w:val="Footnote Text"/>
     <w:basedOn w:val="Normal"/>
     <w:next w:val="FootnoteText"/>
@@ -5577,28 +5481,43 @@
     <w:unhideWhenUsed/>
     <w:qFormat/>
   </w:style>
-  <w:style w:type="character" w:default="1" w:styleId="DefaultParagraphFont">
+  <w:style w:default="1" w:styleId="DefaultParagraphFont" w:type="character">
     <w:name w:val="Default Paragraph Font"/>
     <w:semiHidden/>
     <w:unhideWhenUsed/>
   </w:style>
-  <w:style w:type="table" w:default="1" w:styleId="Table">
+  <w:style w:default="1" w:styleId="Table" w:type="table">
     <w:name w:val="Table"/>
     <w:basedOn w:val="TableNormal"/>
     <w:semiHidden/>
     <w:unhideWhenUsed/>
     <w:qFormat/>
     <w:tblPr>
-      <w:tblInd w:w="0" w:type="dxa"/>
+      <w:tblInd w:type="dxa" w:w="0"/>
       <w:tblCellMar>
-        <w:top w:w="0" w:type="dxa"/>
-        <w:left w:w="108" w:type="dxa"/>
-        <w:bottom w:w="0" w:type="dxa"/>
-        <w:right w:w="108" w:type="dxa"/>
+        <w:top w:type="dxa" w:w="0"/>
+        <w:left w:type="dxa" w:w="108"/>
+        <w:bottom w:type="dxa" w:w="0"/>
+        <w:right w:type="dxa" w:w="108"/>
       </w:tblCellMar>
     </w:tblPr>
-  </w:style>
-  <w:style w:type="paragraph" w:customStyle="1" w:styleId="DefinitionTerm">
+    <w:tblStylePr w:type="firstRow">
+      <w:tblPr>
+        <w:jc w:val="left"/>
+        <w:tblInd w:type="dxa" w:w="0"/>
+      </w:tblPr>
+      <w:trPr>
+        <w:jc w:val="left"/>
+      </w:trPr>
+      <w:tcPr>
+        <w:vAlign w:val="bottom"/>
+        <w:tcBorders>
+          <w:bottom w:val="single"/>
+        </w:tcBorders>
+      </w:tcPr>
+    </w:tblStylePr>
+  </w:style>
+  <w:style w:customStyle="1" w:styleId="DefinitionTerm" w:type="paragraph">
     <w:name w:val="Definition Term"/>
     <w:basedOn w:val="Normal"/>
     <w:next w:val="Definition"/>
@@ -5611,49 +5530,49 @@
       <w:b/>
     </w:rPr>
   </w:style>
-  <w:style w:type="paragraph" w:customStyle="1" w:styleId="Definition">
+  <w:style w:customStyle="1" w:styleId="Definition" w:type="paragraph">
     <w:name w:val="Definition"/>
     <w:basedOn w:val="Normal"/>
   </w:style>
-  <w:style w:type="paragraph" w:styleId="Caption">
+  <w:style w:styleId="Caption" w:type="paragraph">
     <w:name w:val="Caption"/>
     <w:basedOn w:val="Normal"/>
     <w:link w:val="BodyTextChar"/>
     <w:pPr>
-      <w:spacing w:before="0" w:after="120"/>
+      <w:spacing w:after="120" w:before="0"/>
     </w:pPr>
     <w:rPr>
       <w:i/>
     </w:rPr>
   </w:style>
-  <w:style w:type="paragraph" w:customStyle="1" w:styleId="TableCaption">
+  <w:style w:customStyle="1" w:styleId="TableCaption" w:type="paragraph">
     <w:name w:val="Table Caption"/>
     <w:basedOn w:val="Caption"/>
     <w:pPr>
       <w:keepNext/>
     </w:pPr>
   </w:style>
-  <w:style w:type="paragraph" w:customStyle="1" w:styleId="ImageCaption">
+  <w:style w:customStyle="1" w:styleId="ImageCaption" w:type="paragraph">
     <w:name w:val="Image Caption"/>
     <w:basedOn w:val="Caption"/>
   </w:style>
-  <w:style w:type="paragraph" w:customStyle="1" w:styleId="Figure">
+  <w:style w:customStyle="1" w:styleId="Figure" w:type="paragraph">
     <w:name w:val="Figure"/>
     <w:basedOn w:val="Normal"/>
   </w:style>
-  <w:style w:type="paragraph" w:customStyle="1" w:styleId="CaptionedFigure">
+  <w:style w:customStyle="1" w:styleId="CaptionedFigure" w:type="paragraph">
     <w:name w:val="Captioned Figure"/>
     <w:basedOn w:val="Figure"/>
     <w:pPr>
       <w:keepNext/>
     </w:pPr>
   </w:style>
-  <w:style w:type="character" w:customStyle="1" w:styleId="BodyTextChar">
+  <w:style w:customStyle="1" w:styleId="BodyTextChar" w:type="character">
     <w:name w:val="Body Text Char"/>
     <w:basedOn w:val="DefaultParagraphFont"/>
     <w:link w:val="BodyText"/>
   </w:style>
-  <w:style w:type="character" w:customStyle="1" w:styleId="VerbatimChar">
+  <w:style w:customStyle="1" w:styleId="VerbatimChar" w:type="character">
     <w:name w:val="Verbatim Char"/>
     <w:basedOn w:val="BodyTextChar"/>
     <w:rPr>
@@ -5661,21 +5580,25 @@
       <w:sz w:val="22"/>
     </w:rPr>
   </w:style>
-  <w:style w:type="character" w:styleId="FootnoteReference">
+  <w:style w:customStyle="1" w:styleId="SectionNumber" w:type="character">
+    <w:name w:val="Section Number"/>
+    <w:basedOn w:val="BodyTextChar"/>
+  </w:style>
+  <w:style w:styleId="FootnoteReference" w:type="character">
     <w:name w:val="Footnote Reference"/>
     <w:basedOn w:val="BodyTextChar"/>
     <w:rPr>
       <w:vertAlign w:val="superscript"/>
     </w:rPr>
   </w:style>
-  <w:style w:type="character" w:styleId="Hyperlink">
+  <w:style w:styleId="Hyperlink" w:type="character">
     <w:name w:val="Hyperlink"/>
     <w:basedOn w:val="BodyTextChar"/>
     <w:rPr>
-      <w:color w:val="4F81BD" w:themeColor="accent1"/>
+      <w:color w:themeColor="accent1" w:val="4F81BD"/>
     </w:rPr>
   </w:style>
-  <w:style w:type="paragraph" w:styleId="TOCHeading">
+  <w:style w:styleId="TOCHeading" w:type="paragraph">
     <w:name w:val="TOC Heading"/>
     <w:basedOn w:val="Heading1"/>
     <w:next w:val="BodyText"/>
@@ -5687,10 +5610,10 @@
       <w:outlineLvl w:val="9"/>
     </w:pPr>
     <w:rPr>
-      <w:rFonts w:asciiTheme="majorHAnsi" w:eastAsiaTheme="majorEastAsia" w:hAnsiTheme="majorHAnsi" w:cstheme="majorBidi"/>
+      <w:rFonts w:asciiTheme="majorHAnsi" w:cstheme="majorBidi" w:eastAsiaTheme="majorEastAsia" w:hAnsiTheme="majorHAnsi"/>
       <w:b w:val="0"/>
       <w:bCs w:val="0"/>
-      <w:color w:val="365F91" w:themeColor="accent1" w:themeShade="BF"/>
+      <w:color w:themeColor="accent1" w:themeShade="BF" w:val="365F91"/>
     </w:rPr>
   </w:style>
   <w:style w:type="paragraph" w:customStyle="1" w:styleId="SourceCode">
@@ -5782,7 +5705,10 @@
   <w:style w:type="character" w:customStyle="1" w:styleId="ImportTok">
     <w:name w:val="ImportTok"/>
     <w:basedOn w:val="VerbatimChar"/>
-    <w:rPr/>
+    <w:rPr>
+      <w:color w:val="008000"/>
+      <w:b/>
+    </w:rPr>
   </w:style>
   <w:style w:type="character" w:customStyle="1" w:styleId="CommentTok">
     <w:name w:val="CommentTok"/>
@@ -5857,7 +5783,9 @@
   <w:style w:type="character" w:customStyle="1" w:styleId="BuiltInTok">
     <w:name w:val="BuiltInTok"/>
     <w:basedOn w:val="VerbatimChar"/>
-    <w:rPr/>
+    <w:rPr>
+      <w:color w:val="008000"/>
+    </w:rPr>
   </w:style>
   <w:style w:type="character" w:customStyle="1" w:styleId="ExtensionTok">
     <w:name w:val="ExtensionTok"/>

</xml_diff>